<commit_message>
Add interface screenshots to user wiki
</commit_message>
<xml_diff>
--- a/reports/Практическая_работа_10_Документирование_ПО.docx
+++ b/reports/Практическая_работа_10_Документирование_ПО.docx
@@ -554,6 +554,249 @@
         <w:t>В ходе практической работы была создана документация разработчика при помощи TypeDoc и подготовлена пользовательская документация в формате GitHub Wiki. Разработанные материалы упрощают сопровождение программного продукта и помогают пользователям выполнять основные действия в системе.</w:t>
       </w:r>
     </w:p>
+    <w:p>
+      <w:r>
+        <w:br w:type="page"/>
+      </w:r>
+    </w:p>
+    <w:p>
+      <w:pPr>
+        <w:pStyle w:val="Heading1"/>
+      </w:pPr>
+      <w:r>
+        <w:t>Приложение. Интерфейс пользователя</w:t>
+      </w:r>
+    </w:p>
+    <w:p>
+      <w:r>
+        <w:t>Пользовательская Wiki-документация дополнена изображениями интерфейса. Ниже приведены основные экраны и элементы, которые используются пользователем при работе с системой.</w:t>
+      </w:r>
+    </w:p>
+    <w:p>
+      <w:pPr>
+        <w:pStyle w:val="Heading2"/>
+      </w:pPr>
+      <w:r>
+        <w:t>Главная страница</w:t>
+      </w:r>
+    </w:p>
+    <w:p>
+      <w:pPr>
+        <w:jc w:val="center"/>
+      </w:pPr>
+      <w:r>
+        <w:drawing>
+          <wp:inline xmlns:a="http://schemas.openxmlformats.org/drawingml/2006/main" xmlns:pic="http://schemas.openxmlformats.org/drawingml/2006/picture">
+            <wp:extent cx="5400000" cy="11781818"/>
+            <wp:docPr id="1" name="Picture 1"/>
+            <wp:cNvGraphicFramePr>
+              <a:graphicFrameLocks noChangeAspect="1"/>
+            </wp:cNvGraphicFramePr>
+            <a:graphic>
+              <a:graphicData uri="http://schemas.openxmlformats.org/drawingml/2006/picture">
+                <pic:pic>
+                  <pic:nvPicPr>
+                    <pic:cNvPr id="0" name="interface-home.png"/>
+                    <pic:cNvPicPr/>
+                  </pic:nvPicPr>
+                  <pic:blipFill>
+                    <a:blip r:embed="rId9"/>
+                    <a:stretch>
+                      <a:fillRect/>
+                    </a:stretch>
+                  </pic:blipFill>
+                  <pic:spPr>
+                    <a:xfrm>
+                      <a:off x="0" y="0"/>
+                      <a:ext cx="5400000" cy="11781818"/>
+                    </a:xfrm>
+                    <a:prstGeom prst="rect"/>
+                  </pic:spPr>
+                </pic:pic>
+              </a:graphicData>
+            </a:graphic>
+          </wp:inline>
+        </w:drawing>
+      </w:r>
+    </w:p>
+    <w:p>
+      <w:pPr>
+        <w:jc w:val="center"/>
+      </w:pPr>
+      <w:r>
+        <w:t>Общий вид главной страницы с поиском, навигацией, преимуществами и карточками товаров.</w:t>
+      </w:r>
+    </w:p>
+    <w:p>
+      <w:pPr>
+        <w:pStyle w:val="Heading2"/>
+      </w:pPr>
+      <w:r>
+        <w:t>Основные элементы интерфейса</w:t>
+      </w:r>
+    </w:p>
+    <w:p>
+      <w:pPr>
+        <w:jc w:val="center"/>
+      </w:pPr>
+      <w:r>
+        <w:drawing>
+          <wp:inline xmlns:a="http://schemas.openxmlformats.org/drawingml/2006/main" xmlns:pic="http://schemas.openxmlformats.org/drawingml/2006/picture">
+            <wp:extent cx="5400000" cy="4686248"/>
+            <wp:docPr id="2" name="Picture 2"/>
+            <wp:cNvGraphicFramePr>
+              <a:graphicFrameLocks noChangeAspect="1"/>
+            </wp:cNvGraphicFramePr>
+            <a:graphic>
+              <a:graphicData uri="http://schemas.openxmlformats.org/drawingml/2006/picture">
+                <pic:pic>
+                  <pic:nvPicPr>
+                    <pic:cNvPr id="0" name="interface-annotated-overview.png"/>
+                    <pic:cNvPicPr/>
+                  </pic:nvPicPr>
+                  <pic:blipFill>
+                    <a:blip r:embed="rId10"/>
+                    <a:stretch>
+                      <a:fillRect/>
+                    </a:stretch>
+                  </pic:blipFill>
+                  <pic:spPr>
+                    <a:xfrm>
+                      <a:off x="0" y="0"/>
+                      <a:ext cx="5400000" cy="4686248"/>
+                    </a:xfrm>
+                    <a:prstGeom prst="rect"/>
+                  </pic:spPr>
+                </pic:pic>
+              </a:graphicData>
+            </a:graphic>
+          </wp:inline>
+        </w:drawing>
+      </w:r>
+    </w:p>
+    <w:p>
+      <w:pPr>
+        <w:jc w:val="center"/>
+      </w:pPr>
+      <w:r>
+        <w:t>Аннотированный вид интерфейса: поиск, корзина, переключение языка и карточки товаров.</w:t>
+      </w:r>
+    </w:p>
+    <w:p>
+      <w:pPr>
+        <w:pStyle w:val="Heading2"/>
+      </w:pPr>
+      <w:r>
+        <w:t>Верхняя панель</w:t>
+      </w:r>
+    </w:p>
+    <w:p>
+      <w:pPr>
+        <w:jc w:val="center"/>
+      </w:pPr>
+      <w:r>
+        <w:drawing>
+          <wp:inline xmlns:a="http://schemas.openxmlformats.org/drawingml/2006/main" xmlns:pic="http://schemas.openxmlformats.org/drawingml/2006/picture">
+            <wp:extent cx="5400000" cy="254571"/>
+            <wp:docPr id="3" name="Picture 3"/>
+            <wp:cNvGraphicFramePr>
+              <a:graphicFrameLocks noChangeAspect="1"/>
+            </wp:cNvGraphicFramePr>
+            <a:graphic>
+              <a:graphicData uri="http://schemas.openxmlformats.org/drawingml/2006/picture">
+                <pic:pic>
+                  <pic:nvPicPr>
+                    <pic:cNvPr id="0" name="interface-header.png"/>
+                    <pic:cNvPicPr/>
+                  </pic:nvPicPr>
+                  <pic:blipFill>
+                    <a:blip r:embed="rId11"/>
+                    <a:stretch>
+                      <a:fillRect/>
+                    </a:stretch>
+                  </pic:blipFill>
+                  <pic:spPr>
+                    <a:xfrm>
+                      <a:off x="0" y="0"/>
+                      <a:ext cx="5400000" cy="254571"/>
+                    </a:xfrm>
+                    <a:prstGeom prst="rect"/>
+                  </pic:spPr>
+                </pic:pic>
+              </a:graphicData>
+            </a:graphic>
+          </wp:inline>
+        </w:drawing>
+      </w:r>
+    </w:p>
+    <w:p>
+      <w:pPr>
+        <w:jc w:val="center"/>
+      </w:pPr>
+      <w:r>
+        <w:t>Навигация, переключение языка, корзина, вход и регистрация.</w:t>
+      </w:r>
+    </w:p>
+    <w:p>
+      <w:pPr>
+        <w:pStyle w:val="Heading2"/>
+      </w:pPr>
+      <w:r>
+        <w:t>Карточки товаров</w:t>
+      </w:r>
+    </w:p>
+    <w:p>
+      <w:pPr>
+        <w:jc w:val="center"/>
+      </w:pPr>
+      <w:r>
+        <w:drawing>
+          <wp:inline xmlns:a="http://schemas.openxmlformats.org/drawingml/2006/main" xmlns:pic="http://schemas.openxmlformats.org/drawingml/2006/picture">
+            <wp:extent cx="5400000" cy="4251969"/>
+            <wp:docPr id="4" name="Picture 4"/>
+            <wp:cNvGraphicFramePr>
+              <a:graphicFrameLocks noChangeAspect="1"/>
+            </wp:cNvGraphicFramePr>
+            <a:graphic>
+              <a:graphicData uri="http://schemas.openxmlformats.org/drawingml/2006/picture">
+                <pic:pic>
+                  <pic:nvPicPr>
+                    <pic:cNvPr id="0" name="interface-product-cards.png"/>
+                    <pic:cNvPicPr/>
+                  </pic:nvPicPr>
+                  <pic:blipFill>
+                    <a:blip r:embed="rId12"/>
+                    <a:stretch>
+                      <a:fillRect/>
+                    </a:stretch>
+                  </pic:blipFill>
+                  <pic:spPr>
+                    <a:xfrm>
+                      <a:off x="0" y="0"/>
+                      <a:ext cx="5400000" cy="4251969"/>
+                    </a:xfrm>
+                    <a:prstGeom prst="rect"/>
+                  </pic:spPr>
+                </pic:pic>
+              </a:graphicData>
+            </a:graphic>
+          </wp:inline>
+        </w:drawing>
+      </w:r>
+    </w:p>
+    <w:p>
+      <w:pPr>
+        <w:jc w:val="center"/>
+      </w:pPr>
+      <w:r>
+        <w:t>Карточки с изображением, ценой, названием и кнопками Details/Add to cart.</w:t>
+      </w:r>
+    </w:p>
+    <w:p>
+      <w:r>
+        <w:t>Таким образом, пользовательская документация содержит не только текстовые инструкции, но и визуальное описание интерфейса приложения.</w:t>
+      </w:r>
+    </w:p>
     <w:sectPr>
       <w:pgSz w:w="12240" w:h="15840"/>
       <w:pgMar w:top="1134" w:right="850" w:bottom="1134" w:left="1701" w:header="720" w:footer="720" w:gutter="0"/>

</xml_diff>

<commit_message>
Replace developer docs with API reference
</commit_message>
<xml_diff>
--- a/reports/Практическая_работа_10_Документирование_ПО.docx
+++ b/reports/Практическая_работа_10_Документирование_ПО.docx
@@ -78,7 +78,7 @@
     </w:p>
     <w:p>
       <w:r>
-        <w:t>Создать документацию разработчика при помощи инструмента генерации документации кода и подготовить пользовательскую документацию для выбранного программного проекта.</w:t>
+        <w:t>Создать документацию разработчика и пользовательскую документацию для выбранного программного проекта. Документация разработчика должна описывать программные интерфейсы системы, а пользовательская документация должна содержать описание интерфейса приложения.</w:t>
       </w:r>
     </w:p>
     <w:p>
@@ -91,7 +91,7 @@
     </w:p>
     <w:p>
       <w:r>
-        <w:t>Документирование выполнено для проекта Legal Store - веб-приложения интернет-магазина цифровых товаров. Проект содержит клиентскую часть, серверную логику, работу с базой данных, корзину, оформление заказа и интеграцию с Digiseller.</w:t>
+        <w:t>Документирование выполнено для проекта Legal Store - веб-приложения интернет-магазина цифровых товаров и лицензионных ключей. Проект содержит каталог товаров, корзину, оформление заказа, интеграцию с Digiseller, избранное, авторизацию и административные функции.</w:t>
       </w:r>
     </w:p>
     <w:p>
@@ -104,7 +104,7 @@
     </w:p>
     <w:p>
       <w:r>
-        <w:t>Для создания документации разработчика выбран инструмент TypeDoc. Он анализирует TypeScript-код и формирует HTML-документацию по модулям, функциям, типам и экспортируемым сущностям проекта.</w:t>
+        <w:t>Документация разработчика оформлена как API-документация, поскольку ключевое взаимодействие клиентской части с сервером выполняется через Next.js API routes. Для каждого endpoint описаны HTTP-метод, назначение, параметры, формат запроса, формат ответа и возможные ошибки.</w:t>
       </w:r>
     </w:p>
     <w:p>
@@ -112,7 +112,7 @@
         <w:pStyle w:val="Heading2"/>
       </w:pPr>
       <w:r>
-        <w:t>Причины выбора TypeDoc</w:t>
+        <w:t>Состав документации разработчика</w:t>
       </w:r>
     </w:p>
     <w:p>
@@ -120,7 +120,7 @@
         <w:pStyle w:val="ListBullet"/>
       </w:pPr>
       <w:r>
-        <w:t>проект написан на TypeScript;</w:t>
+        <w:t>api_reference.md - подробное описание API проекта;</w:t>
       </w:r>
     </w:p>
     <w:p>
@@ -128,7 +128,7 @@
         <w:pStyle w:val="ListBullet"/>
       </w:pPr>
       <w:r>
-        <w:t>TypeDoc поддерживает автоматическую генерацию HTML-документации;</w:t>
+        <w:t>openapi.yaml - спецификация OpenAPI 3.0 для импорта в Swagger, Postman или Insomnia;</w:t>
       </w:r>
     </w:p>
     <w:p>
@@ -136,15 +136,7 @@
         <w:pStyle w:val="ListBullet"/>
       </w:pPr>
       <w:r>
-        <w:t>документацию можно хранить в репозитории и обновлять при изменении кода;</w:t>
-      </w:r>
-    </w:p>
-    <w:p>
-      <w:pPr>
-        <w:pStyle w:val="ListBullet"/>
-      </w:pPr>
-      <w:r>
-        <w:t>полученный HTML-формат удобно открыть в браузере.</w:t>
+        <w:t>developer_documentation.zip - дополнительный архив HTML-документации по TypeScript-модулям.</w:t>
       </w:r>
     </w:p>
     <w:p>
@@ -152,76 +144,606 @@
         <w:pStyle w:val="Heading2"/>
       </w:pPr>
       <w:r>
-        <w:t>Охваченные модули</w:t>
+        <w:t>Основные API проекта</w:t>
       </w:r>
     </w:p>
+    <w:tbl>
+      <w:tblPr>
+        <w:tblStyle w:val="TableGrid"/>
+        <w:tblW w:type="auto" w:w="0"/>
+        <w:jc w:val="center"/>
+        <w:tblLook w:firstColumn="1" w:firstRow="1" w:lastColumn="0" w:lastRow="0" w:noHBand="0" w:noVBand="1" w:val="04A0"/>
+      </w:tblPr>
+      <w:tblGrid>
+        <w:gridCol w:w="2422"/>
+        <w:gridCol w:w="2422"/>
+        <w:gridCol w:w="2422"/>
+        <w:gridCol w:w="2422"/>
+      </w:tblGrid>
+      <w:tr>
+        <w:tc>
+          <w:tcPr>
+            <w:tcW w:type="dxa" w:w="2422"/>
+            <w:vAlign w:val="center"/>
+          </w:tcPr>
+          <w:p>
+            <w:r>
+              <w:t>Метод</w:t>
+            </w:r>
+          </w:p>
+        </w:tc>
+        <w:tc>
+          <w:tcPr>
+            <w:tcW w:type="dxa" w:w="2422"/>
+            <w:vAlign w:val="center"/>
+          </w:tcPr>
+          <w:p>
+            <w:r>
+              <w:t>Endpoint</w:t>
+            </w:r>
+          </w:p>
+        </w:tc>
+        <w:tc>
+          <w:tcPr>
+            <w:tcW w:type="dxa" w:w="2422"/>
+            <w:vAlign w:val="center"/>
+          </w:tcPr>
+          <w:p>
+            <w:r>
+              <w:t>Назначение</w:t>
+            </w:r>
+          </w:p>
+        </w:tc>
+        <w:tc>
+          <w:tcPr>
+            <w:tcW w:type="dxa" w:w="2422"/>
+            <w:vAlign w:val="center"/>
+          </w:tcPr>
+          <w:p>
+            <w:r>
+              <w:t>Доступ</w:t>
+            </w:r>
+          </w:p>
+        </w:tc>
+      </w:tr>
+      <w:tr>
+        <w:tc>
+          <w:tcPr>
+            <w:tcW w:type="dxa" w:w="2422"/>
+            <w:vAlign w:val="center"/>
+          </w:tcPr>
+          <w:p>
+            <w:r>
+              <w:t>GET/POST</w:t>
+            </w:r>
+          </w:p>
+        </w:tc>
+        <w:tc>
+          <w:tcPr>
+            <w:tcW w:type="dxa" w:w="2422"/>
+            <w:vAlign w:val="center"/>
+          </w:tcPr>
+          <w:p>
+            <w:r>
+              <w:t>/api/auth/[...nextauth]</w:t>
+            </w:r>
+          </w:p>
+        </w:tc>
+        <w:tc>
+          <w:tcPr>
+            <w:tcW w:type="dxa" w:w="2422"/>
+            <w:vAlign w:val="center"/>
+          </w:tcPr>
+          <w:p>
+            <w:r>
+              <w:t>Служебные маршруты NextAuth</w:t>
+            </w:r>
+          </w:p>
+        </w:tc>
+        <w:tc>
+          <w:tcPr>
+            <w:tcW w:type="dxa" w:w="2422"/>
+            <w:vAlign w:val="center"/>
+          </w:tcPr>
+          <w:p>
+            <w:r>
+              <w:t>Публичный/сессионный</w:t>
+            </w:r>
+          </w:p>
+        </w:tc>
+      </w:tr>
+      <w:tr>
+        <w:tc>
+          <w:tcPr>
+            <w:tcW w:type="dxa" w:w="2422"/>
+            <w:vAlign w:val="center"/>
+          </w:tcPr>
+          <w:p>
+            <w:r>
+              <w:t>POST</w:t>
+            </w:r>
+          </w:p>
+        </w:tc>
+        <w:tc>
+          <w:tcPr>
+            <w:tcW w:type="dxa" w:w="2422"/>
+            <w:vAlign w:val="center"/>
+          </w:tcPr>
+          <w:p>
+            <w:r>
+              <w:t>/api/auth/register</w:t>
+            </w:r>
+          </w:p>
+        </w:tc>
+        <w:tc>
+          <w:tcPr>
+            <w:tcW w:type="dxa" w:w="2422"/>
+            <w:vAlign w:val="center"/>
+          </w:tcPr>
+          <w:p>
+            <w:r>
+              <w:t>Регистрация пользователя</w:t>
+            </w:r>
+          </w:p>
+        </w:tc>
+        <w:tc>
+          <w:tcPr>
+            <w:tcW w:type="dxa" w:w="2422"/>
+            <w:vAlign w:val="center"/>
+          </w:tcPr>
+          <w:p>
+            <w:r>
+              <w:t>Публичный</w:t>
+            </w:r>
+          </w:p>
+        </w:tc>
+      </w:tr>
+      <w:tr>
+        <w:tc>
+          <w:tcPr>
+            <w:tcW w:type="dxa" w:w="2422"/>
+            <w:vAlign w:val="center"/>
+          </w:tcPr>
+          <w:p>
+            <w:r>
+              <w:t>POST</w:t>
+            </w:r>
+          </w:p>
+        </w:tc>
+        <w:tc>
+          <w:tcPr>
+            <w:tcW w:type="dxa" w:w="2422"/>
+            <w:vAlign w:val="center"/>
+          </w:tcPr>
+          <w:p>
+            <w:r>
+              <w:t>/api/checkout/create-payment</w:t>
+            </w:r>
+          </w:p>
+        </w:tc>
+        <w:tc>
+          <w:tcPr>
+            <w:tcW w:type="dxa" w:w="2422"/>
+            <w:vAlign w:val="center"/>
+          </w:tcPr>
+          <w:p>
+            <w:r>
+              <w:t>Создание заказа и ссылки оплаты</w:t>
+            </w:r>
+          </w:p>
+        </w:tc>
+        <w:tc>
+          <w:tcPr>
+            <w:tcW w:type="dxa" w:w="2422"/>
+            <w:vAlign w:val="center"/>
+          </w:tcPr>
+          <w:p>
+            <w:r>
+              <w:t>Публичный/сессионный</w:t>
+            </w:r>
+          </w:p>
+        </w:tc>
+      </w:tr>
+      <w:tr>
+        <w:tc>
+          <w:tcPr>
+            <w:tcW w:type="dxa" w:w="2422"/>
+            <w:vAlign w:val="center"/>
+          </w:tcPr>
+          <w:p>
+            <w:r>
+              <w:t>POST</w:t>
+            </w:r>
+          </w:p>
+        </w:tc>
+        <w:tc>
+          <w:tcPr>
+            <w:tcW w:type="dxa" w:w="2422"/>
+            <w:vAlign w:val="center"/>
+          </w:tcPr>
+          <w:p>
+            <w:r>
+              <w:t>/api/digiseller/callback</w:t>
+            </w:r>
+          </w:p>
+        </w:tc>
+        <w:tc>
+          <w:tcPr>
+            <w:tcW w:type="dxa" w:w="2422"/>
+            <w:vAlign w:val="center"/>
+          </w:tcPr>
+          <w:p>
+            <w:r>
+              <w:t>Webhook подтверждения оплаты</w:t>
+            </w:r>
+          </w:p>
+        </w:tc>
+        <w:tc>
+          <w:tcPr>
+            <w:tcW w:type="dxa" w:w="2422"/>
+            <w:vAlign w:val="center"/>
+          </w:tcPr>
+          <w:p>
+            <w:r>
+              <w:t>Digiseller</w:t>
+            </w:r>
+          </w:p>
+        </w:tc>
+      </w:tr>
+      <w:tr>
+        <w:tc>
+          <w:tcPr>
+            <w:tcW w:type="dxa" w:w="2422"/>
+            <w:vAlign w:val="center"/>
+          </w:tcPr>
+          <w:p>
+            <w:r>
+              <w:t>GET</w:t>
+            </w:r>
+          </w:p>
+        </w:tc>
+        <w:tc>
+          <w:tcPr>
+            <w:tcW w:type="dxa" w:w="2422"/>
+            <w:vAlign w:val="center"/>
+          </w:tcPr>
+          <w:p>
+            <w:r>
+              <w:t>/api/digiseller/return</w:t>
+            </w:r>
+          </w:p>
+        </w:tc>
+        <w:tc>
+          <w:tcPr>
+            <w:tcW w:type="dxa" w:w="2422"/>
+            <w:vAlign w:val="center"/>
+          </w:tcPr>
+          <w:p>
+            <w:r>
+              <w:t>Возврат пользователя после оплаты</w:t>
+            </w:r>
+          </w:p>
+        </w:tc>
+        <w:tc>
+          <w:tcPr>
+            <w:tcW w:type="dxa" w:w="2422"/>
+            <w:vAlign w:val="center"/>
+          </w:tcPr>
+          <w:p>
+            <w:r>
+              <w:t>Публичный</w:t>
+            </w:r>
+          </w:p>
+        </w:tc>
+      </w:tr>
+      <w:tr>
+        <w:tc>
+          <w:tcPr>
+            <w:tcW w:type="dxa" w:w="2422"/>
+            <w:vAlign w:val="center"/>
+          </w:tcPr>
+          <w:p>
+            <w:r>
+              <w:t>GET</w:t>
+            </w:r>
+          </w:p>
+        </w:tc>
+        <w:tc>
+          <w:tcPr>
+            <w:tcW w:type="dxa" w:w="2422"/>
+            <w:vAlign w:val="center"/>
+          </w:tcPr>
+          <w:p>
+            <w:r>
+              <w:t>/api/favorites</w:t>
+            </w:r>
+          </w:p>
+        </w:tc>
+        <w:tc>
+          <w:tcPr>
+            <w:tcW w:type="dxa" w:w="2422"/>
+            <w:vAlign w:val="center"/>
+          </w:tcPr>
+          <w:p>
+            <w:r>
+              <w:t>Получение избранного</w:t>
+            </w:r>
+          </w:p>
+        </w:tc>
+        <w:tc>
+          <w:tcPr>
+            <w:tcW w:type="dxa" w:w="2422"/>
+            <w:vAlign w:val="center"/>
+          </w:tcPr>
+          <w:p>
+            <w:r>
+              <w:t>Авторизованный пользователь</w:t>
+            </w:r>
+          </w:p>
+        </w:tc>
+      </w:tr>
+      <w:tr>
+        <w:tc>
+          <w:tcPr>
+            <w:tcW w:type="dxa" w:w="2422"/>
+            <w:vAlign w:val="center"/>
+          </w:tcPr>
+          <w:p>
+            <w:r>
+              <w:t>POST</w:t>
+            </w:r>
+          </w:p>
+        </w:tc>
+        <w:tc>
+          <w:tcPr>
+            <w:tcW w:type="dxa" w:w="2422"/>
+            <w:vAlign w:val="center"/>
+          </w:tcPr>
+          <w:p>
+            <w:r>
+              <w:t>/api/favorites/toggle</w:t>
+            </w:r>
+          </w:p>
+        </w:tc>
+        <w:tc>
+          <w:tcPr>
+            <w:tcW w:type="dxa" w:w="2422"/>
+            <w:vAlign w:val="center"/>
+          </w:tcPr>
+          <w:p>
+            <w:r>
+              <w:t>Переключение избранного</w:t>
+            </w:r>
+          </w:p>
+        </w:tc>
+        <w:tc>
+          <w:tcPr>
+            <w:tcW w:type="dxa" w:w="2422"/>
+            <w:vAlign w:val="center"/>
+          </w:tcPr>
+          <w:p>
+            <w:r>
+              <w:t>Авторизованный пользователь</w:t>
+            </w:r>
+          </w:p>
+        </w:tc>
+      </w:tr>
+      <w:tr>
+        <w:tc>
+          <w:tcPr>
+            <w:tcW w:type="dxa" w:w="2422"/>
+            <w:vAlign w:val="center"/>
+          </w:tcPr>
+          <w:p>
+            <w:r>
+              <w:t>POST</w:t>
+            </w:r>
+          </w:p>
+        </w:tc>
+        <w:tc>
+          <w:tcPr>
+            <w:tcW w:type="dxa" w:w="2422"/>
+            <w:vAlign w:val="center"/>
+          </w:tcPr>
+          <w:p>
+            <w:r>
+              <w:t>/api/favorites/sync</w:t>
+            </w:r>
+          </w:p>
+        </w:tc>
+        <w:tc>
+          <w:tcPr>
+            <w:tcW w:type="dxa" w:w="2422"/>
+            <w:vAlign w:val="center"/>
+          </w:tcPr>
+          <w:p>
+            <w:r>
+              <w:t>Синхронизация избранного</w:t>
+            </w:r>
+          </w:p>
+        </w:tc>
+        <w:tc>
+          <w:tcPr>
+            <w:tcW w:type="dxa" w:w="2422"/>
+            <w:vAlign w:val="center"/>
+          </w:tcPr>
+          <w:p>
+            <w:r>
+              <w:t>Авторизованный пользователь</w:t>
+            </w:r>
+          </w:p>
+        </w:tc>
+      </w:tr>
+      <w:tr>
+        <w:tc>
+          <w:tcPr>
+            <w:tcW w:type="dxa" w:w="2422"/>
+            <w:vAlign w:val="center"/>
+          </w:tcPr>
+          <w:p>
+            <w:r>
+              <w:t>POST</w:t>
+            </w:r>
+          </w:p>
+        </w:tc>
+        <w:tc>
+          <w:tcPr>
+            <w:tcW w:type="dxa" w:w="2422"/>
+            <w:vAlign w:val="center"/>
+          </w:tcPr>
+          <w:p>
+            <w:r>
+              <w:t>/api/jobs/fulfill</w:t>
+            </w:r>
+          </w:p>
+        </w:tc>
+        <w:tc>
+          <w:tcPr>
+            <w:tcW w:type="dxa" w:w="2422"/>
+            <w:vAlign w:val="center"/>
+          </w:tcPr>
+          <w:p>
+            <w:r>
+              <w:t>Обработка выдачи цифрового товара</w:t>
+            </w:r>
+          </w:p>
+        </w:tc>
+        <w:tc>
+          <w:tcPr>
+            <w:tcW w:type="dxa" w:w="2422"/>
+            <w:vAlign w:val="center"/>
+          </w:tcPr>
+          <w:p>
+            <w:r>
+              <w:t>Служебный</w:t>
+            </w:r>
+          </w:p>
+        </w:tc>
+      </w:tr>
+      <w:tr>
+        <w:tc>
+          <w:tcPr>
+            <w:tcW w:type="dxa" w:w="2422"/>
+            <w:vAlign w:val="center"/>
+          </w:tcPr>
+          <w:p>
+            <w:r>
+              <w:t>POST</w:t>
+            </w:r>
+          </w:p>
+        </w:tc>
+        <w:tc>
+          <w:tcPr>
+            <w:tcW w:type="dxa" w:w="2422"/>
+            <w:vAlign w:val="center"/>
+          </w:tcPr>
+          <w:p>
+            <w:r>
+              <w:t>/api/jobs/sync-digiseller</w:t>
+            </w:r>
+          </w:p>
+        </w:tc>
+        <w:tc>
+          <w:tcPr>
+            <w:tcW w:type="dxa" w:w="2422"/>
+            <w:vAlign w:val="center"/>
+          </w:tcPr>
+          <w:p>
+            <w:r>
+              <w:t>Синхронизация Digiseller</w:t>
+            </w:r>
+          </w:p>
+        </w:tc>
+        <w:tc>
+          <w:tcPr>
+            <w:tcW w:type="dxa" w:w="2422"/>
+            <w:vAlign w:val="center"/>
+          </w:tcPr>
+          <w:p>
+            <w:r>
+              <w:t>Служебный</w:t>
+            </w:r>
+          </w:p>
+        </w:tc>
+      </w:tr>
+      <w:tr>
+        <w:tc>
+          <w:tcPr>
+            <w:tcW w:type="dxa" w:w="2422"/>
+            <w:vAlign w:val="center"/>
+          </w:tcPr>
+          <w:p>
+            <w:r>
+              <w:t>POST</w:t>
+            </w:r>
+          </w:p>
+        </w:tc>
+        <w:tc>
+          <w:tcPr>
+            <w:tcW w:type="dxa" w:w="2422"/>
+            <w:vAlign w:val="center"/>
+          </w:tcPr>
+          <w:p>
+            <w:r>
+              <w:t>/api/locale</w:t>
+            </w:r>
+          </w:p>
+        </w:tc>
+        <w:tc>
+          <w:tcPr>
+            <w:tcW w:type="dxa" w:w="2422"/>
+            <w:vAlign w:val="center"/>
+          </w:tcPr>
+          <w:p>
+            <w:r>
+              <w:t>Смена языка интерфейса</w:t>
+            </w:r>
+          </w:p>
+        </w:tc>
+        <w:tc>
+          <w:tcPr>
+            <w:tcW w:type="dxa" w:w="2422"/>
+            <w:vAlign w:val="center"/>
+          </w:tcPr>
+          <w:p>
+            <w:r>
+              <w:t>Публичный</w:t>
+            </w:r>
+          </w:p>
+        </w:tc>
+      </w:tr>
+    </w:tbl>
     <w:p>
       <w:pPr>
-        <w:pStyle w:val="ListBullet"/>
+        <w:pStyle w:val="Heading2"/>
       </w:pPr>
       <w:r>
-        <w:t>src/lib/cart.ts - работа с корзиной;</w:t>
-      </w:r>
-    </w:p>
-    <w:p>
-      <w:pPr>
-        <w:pStyle w:val="ListBullet"/>
-      </w:pPr>
-      <w:r>
-        <w:t>src/lib/fulfillment.ts - выдача цифрового товара;</w:t>
-      </w:r>
-    </w:p>
-    <w:p>
-      <w:pPr>
-        <w:pStyle w:val="ListBullet"/>
-      </w:pPr>
-      <w:r>
-        <w:t>src/lib/products.ts - получение и фильтрация товаров;</w:t>
-      </w:r>
-    </w:p>
-    <w:p>
-      <w:pPr>
-        <w:pStyle w:val="ListBullet"/>
-      </w:pPr>
-      <w:r>
-        <w:t>src/lib/auth-options.ts - настройки авторизации;</w:t>
-      </w:r>
-    </w:p>
-    <w:p>
-      <w:pPr>
-        <w:pStyle w:val="ListBullet"/>
-      </w:pPr>
-      <w:r>
-        <w:t>src/lib/digiseller/client.ts - клиент Digiseller;</w:t>
-      </w:r>
-    </w:p>
-    <w:p>
-      <w:pPr>
-        <w:pStyle w:val="ListBullet"/>
-      </w:pPr>
-      <w:r>
-        <w:t>src/lib/digiseller/checkout.ts - оформление платежа;</w:t>
-      </w:r>
-    </w:p>
-    <w:p>
-      <w:pPr>
-        <w:pStyle w:val="ListBullet"/>
-      </w:pPr>
-      <w:r>
-        <w:t>src/lib/digiseller/catalog.ts - синхронизация каталога;</w:t>
-      </w:r>
-    </w:p>
-    <w:p>
-      <w:pPr>
-        <w:pStyle w:val="ListBullet"/>
-      </w:pPr>
-      <w:r>
-        <w:t>src/app/actions/cart.ts - серверные действия корзины.</w:t>
+        <w:t>Пример описания API</w:t>
       </w:r>
     </w:p>
     <w:p>
       <w:r>
-        <w:t>Сгенерированная документация расположена в каталоге practice_10/developer_documentation/generated. Также подготовлен архив developer_documentation.zip.</w:t>
+        <w:t>Endpoint POST /api/auth/register используется для регистрации пользователя. В запросе передаются email, password и необязательное поле name. Сервер проверяет корректность данных, применяет rate limit, проверяет уникальность email, хеширует пароль и создает пользователя.</w:t>
+      </w:r>
+    </w:p>
+    <w:p>
+      <w:r>
+        <w:t>Пример request body:</w:t>
+      </w:r>
+    </w:p>
+    <w:p>
+      <w:r>
+        <w:t>{ "email": "user@example.com", "password": "password123", "name": "User" }</w:t>
+      </w:r>
+    </w:p>
+    <w:p>
+      <w:r>
+        <w:t>Пример успешного ответа:</w:t>
+      </w:r>
+    </w:p>
+    <w:p>
+      <w:r>
+        <w:t>{ "ok": true, "userId": "clx..." }</w:t>
       </w:r>
     </w:p>
     <w:p>
@@ -229,12 +751,12 @@
         <w:pStyle w:val="Heading2"/>
       </w:pPr>
       <w:r>
-        <w:t>Команда генерации</w:t>
+        <w:t>Служебные API</w:t>
       </w:r>
     </w:p>
     <w:p>
       <w:r>
-        <w:t>npx typedoc --entryPoints src/lib/cart.ts src/lib/fulfillment.ts src/lib/products.ts src/lib/auth-options.ts src/lib/digiseller/client.ts src/lib/digiseller/checkout.ts src/lib/digiseller/catalog.ts src/app/actions/cart.ts --out practice_10/developer_documentation/generated --tsconfig tsconfig.json --skipErrorChecking</w:t>
+        <w:t>Для фоновых задач используются защищенные endpoint /api/jobs/fulfill и /api/jobs/sync-digiseller. Доступ к ним выполняется только при передаче заголовка x-jobs-secret, значение которого должно совпадать с переменной окружения JOBS_SECRET.</w:t>
       </w:r>
     </w:p>
     <w:p>
@@ -247,7 +769,7 @@
     </w:p>
     <w:p>
       <w:r>
-        <w:t>Пользовательская документация оформлена в формате GitHub Wiki. Такой формат удобен для размещения в репозитории и позволяет разделять инструкции по отдельным страницам.</w:t>
+        <w:t>Пользовательская документация оформлена в формате GitHub Wiki. Она содержит не только текстовые инструкции, но и изображения интерфейса приложения: главный экран, верхнюю панель, поиск, карточки товаров, кнопки добавления в корзину и нижнюю часть страницы.</w:t>
       </w:r>
     </w:p>
     <w:p>
@@ -255,7 +777,7 @@
         <w:pStyle w:val="Heading2"/>
       </w:pPr>
       <w:r>
-        <w:t>Структура пользовательской документации</w:t>
+        <w:t>Структура пользовательской Wiki</w:t>
       </w:r>
     </w:p>
     <w:tbl>
@@ -312,7 +834,31 @@
           </w:tcPr>
           <w:p>
             <w:r>
-              <w:t>Главная страница пользовательской документации.</w:t>
+              <w:t>Главная страница Wiki с общим видом интерфейса.</w:t>
+            </w:r>
+          </w:p>
+        </w:tc>
+      </w:tr>
+      <w:tr>
+        <w:tc>
+          <w:tcPr>
+            <w:tcW w:type="dxa" w:w="4844"/>
+            <w:vAlign w:val="center"/>
+          </w:tcPr>
+          <w:p>
+            <w:r>
+              <w:t>User-interface.md</w:t>
+            </w:r>
+          </w:p>
+        </w:tc>
+        <w:tc>
+          <w:tcPr>
+            <w:tcW w:type="dxa" w:w="4844"/>
+            <w:vAlign w:val="center"/>
+          </w:tcPr>
+          <w:p>
+            <w:r>
+              <w:t>Обзор основных элементов пользовательского интерфейса.</w:t>
             </w:r>
           </w:p>
         </w:tc>
@@ -360,7 +906,7 @@
           </w:tcPr>
           <w:p>
             <w:r>
-              <w:t>Просмотр каталога и карточки товара.</w:t>
+              <w:t>Каталог и карточки товаров.</w:t>
             </w:r>
           </w:p>
         </w:tc>
@@ -408,7 +954,7 @@
           </w:tcPr>
           <w:p>
             <w:r>
-              <w:t>Оформление заказа и переход к оплате.</w:t>
+              <w:t>Оформление заказа.</w:t>
             </w:r>
           </w:p>
         </w:tc>
@@ -456,7 +1002,7 @@
           </w:tcPr>
           <w:p>
             <w:r>
-              <w:t>Функции административной панели.</w:t>
+              <w:t>Описание административной панели.</w:t>
             </w:r>
           </w:p>
         </w:tc>
@@ -467,7 +1013,7 @@
         <w:pStyle w:val="Heading1"/>
       </w:pPr>
       <w:r>
-        <w:t>Пример пользовательского сценария</w:t>
+        <w:t>Пользовательский сценарий</w:t>
       </w:r>
     </w:p>
     <w:p>
@@ -475,7 +1021,7 @@
         <w:pStyle w:val="ListNumber"/>
       </w:pPr>
       <w:r>
-        <w:t>Пользователь открывает каталог товаров.</w:t>
+        <w:t>Пользователь открывает главную страницу приложения.</w:t>
       </w:r>
     </w:p>
     <w:p>
@@ -483,7 +1029,7 @@
         <w:pStyle w:val="ListNumber"/>
       </w:pPr>
       <w:r>
-        <w:t>Выбирает нужный товар и открывает карточку.</w:t>
+        <w:t>Через поиск или каталог выбирает цифровой товар.</w:t>
       </w:r>
     </w:p>
     <w:p>
@@ -491,7 +1037,7 @@
         <w:pStyle w:val="ListNumber"/>
       </w:pPr>
       <w:r>
-        <w:t>Добавляет товар в корзину.</w:t>
+        <w:t>Открывает карточку товара или сразу добавляет товар в корзину.</w:t>
       </w:r>
     </w:p>
     <w:p>
@@ -499,7 +1045,7 @@
         <w:pStyle w:val="ListNumber"/>
       </w:pPr>
       <w:r>
-        <w:t>Переходит к оформлению заказа.</w:t>
+        <w:t>Переходит в корзину и проверяет состав заказа.</w:t>
       </w:r>
     </w:p>
     <w:p>
@@ -507,7 +1053,7 @@
         <w:pStyle w:val="ListNumber"/>
       </w:pPr>
       <w:r>
-        <w:t>Оплачивает заказ через Digiseller.</w:t>
+        <w:t>Оформляет заказ и переходит к оплате через Digiseller.</w:t>
       </w:r>
     </w:p>
     <w:p>
@@ -515,48 +1061,7 @@
         <w:pStyle w:val="ListNumber"/>
       </w:pPr>
       <w:r>
-        <w:t>После обработки получает цифровой товар на странице заказа.</w:t>
-      </w:r>
-    </w:p>
-    <w:p>
-      <w:pPr>
-        <w:pStyle w:val="Heading1"/>
-      </w:pPr>
-      <w:r>
-        <w:t>Размещение материалов</w:t>
-      </w:r>
-    </w:p>
-    <w:p>
-      <w:r>
-        <w:t>Документация размещена в GitHub-репозитории:</w:t>
-      </w:r>
-    </w:p>
-    <w:p>
-      <w:r>
-        <w:t>https://github.com/Lettalochka/sipi</w:t>
-      </w:r>
-    </w:p>
-    <w:p>
-      <w:r>
-        <w:t>Документация разработчика находится в practice_10/developer_documentation, пользовательская документация - в practice_10/user_wiki.</w:t>
-      </w:r>
-    </w:p>
-    <w:p>
-      <w:pPr>
-        <w:pStyle w:val="Heading1"/>
-      </w:pPr>
-      <w:r>
-        <w:t>Вывод</w:t>
-      </w:r>
-    </w:p>
-    <w:p>
-      <w:r>
-        <w:t>В ходе практической работы была создана документация разработчика при помощи TypeDoc и подготовлена пользовательская документация в формате GitHub Wiki. Разработанные материалы упрощают сопровождение программного продукта и помогают пользователям выполнять основные действия в системе.</w:t>
-      </w:r>
-    </w:p>
-    <w:p>
-      <w:r>
-        <w:br w:type="page"/>
+        <w:t>После оплаты возвращается на страницу заказа и получает цифровой товар.</w:t>
       </w:r>
     </w:p>
     <w:p>
@@ -565,11 +1070,6 @@
       </w:pPr>
       <w:r>
         <w:t>Приложение. Интерфейс пользователя</w:t>
-      </w:r>
-    </w:p>
-    <w:p>
-      <w:r>
-        <w:t>Пользовательская Wiki-документация дополнена изображениями интерфейса. Ниже приведены основные экраны и элементы, которые используются пользователем при работе с системой.</w:t>
       </w:r>
     </w:p>
     <w:p>
@@ -793,8 +1293,34 @@
       </w:r>
     </w:p>
     <w:p>
+      <w:pPr>
+        <w:pStyle w:val="Heading1"/>
+      </w:pPr>
       <w:r>
-        <w:t>Таким образом, пользовательская документация содержит не только текстовые инструкции, но и визуальное описание интерфейса приложения.</w:t>
+        <w:t>Размещение материалов</w:t>
+      </w:r>
+    </w:p>
+    <w:p>
+      <w:r>
+        <w:t>Материалы размещены в GitHub-репозитории: https://github.com/Lettalochka/sipi</w:t>
+      </w:r>
+    </w:p>
+    <w:p>
+      <w:r>
+        <w:t>API-документация находится в каталоге practice_10/developer_documentation, пользовательская Wiki - в каталоге practice_10/user_wiki.</w:t>
+      </w:r>
+    </w:p>
+    <w:p>
+      <w:pPr>
+        <w:pStyle w:val="Heading1"/>
+      </w:pPr>
+      <w:r>
+        <w:t>Вывод</w:t>
+      </w:r>
+    </w:p>
+    <w:p>
+      <w:r>
+        <w:t>В ходе практической работы была подготовлена документация разработчика в виде API-reference и OpenAPI-спецификации, а также пользовательская Wiki-документация с изображениями интерфейса. Такая структура помогает разработчикам понимать серверные интерфейсы системы, а пользователям - выполнять основные действия в приложении.</w:t>
       </w:r>
     </w:p>
     <w:sectPr>

</xml_diff>

<commit_message>
Use HTML docs for user wiki and API reference
</commit_message>
<xml_diff>
--- a/reports/Практическая_работа_10_Документирование_ПО.docx
+++ b/reports/Практическая_работа_10_Документирование_ПО.docx
@@ -78,7 +78,7 @@
     </w:p>
     <w:p>
       <w:r>
-        <w:t>Создать документацию разработчика и пользовательскую документацию для выбранного программного проекта. Документация разработчика должна описывать программные интерфейсы системы, а пользовательская документация должна содержать описание интерфейса приложения.</w:t>
+        <w:t>Создать документацию разработчика и пользовательскую документацию для проекта Legal Store. Документация разработчика оформляется как HTML/API-reference, а пользовательская документация содержит HTML-код основных элементов интерфейса.</w:t>
       </w:r>
     </w:p>
     <w:p>
@@ -91,7 +91,7 @@
     </w:p>
     <w:p>
       <w:r>
-        <w:t>Документирование выполнено для проекта Legal Store - веб-приложения интернет-магазина цифровых товаров и лицензионных ключей. Проект содержит каталог товаров, корзину, оформление заказа, интеграцию с Digiseller, избранное, авторизацию и административные функции.</w:t>
+        <w:t>Legal Store - веб-приложение интернет-магазина цифровых товаров и лицензионных ключей. Система содержит каталог товаров, корзину, оформление заказа, интеграцию с Digiseller, избранное и авторизацию пользователей.</w:t>
       </w:r>
     </w:p>
     <w:p>
@@ -104,7 +104,7 @@
     </w:p>
     <w:p>
       <w:r>
-        <w:t>Документация разработчика оформлена как API-документация, поскольку ключевое взаимодействие клиентской части с сервером выполняется через Next.js API routes. Для каждого endpoint описаны HTTP-метод, назначение, параметры, формат запроса, формат ответа и возможные ошибки.</w:t>
+        <w:t>Документация разработчика подготовлена в формате API-reference. Для удобства чтения создана отдельная HTML-страница api_reference.html, а для импорта в инструменты разработки подготовлена спецификация OpenAPI 3.0.</w:t>
       </w:r>
     </w:p>
     <w:p>
@@ -112,7 +112,7 @@
         <w:pStyle w:val="Heading2"/>
       </w:pPr>
       <w:r>
-        <w:t>Состав документации разработчика</w:t>
+        <w:t>Файлы документации разработчика</w:t>
       </w:r>
     </w:p>
     <w:p>
@@ -120,7 +120,7 @@
         <w:pStyle w:val="ListBullet"/>
       </w:pPr>
       <w:r>
-        <w:t>api_reference.md - подробное описание API проекта;</w:t>
+        <w:t>api_reference.html - HTML-страница со справочником API;</w:t>
       </w:r>
     </w:p>
     <w:p>
@@ -128,7 +128,7 @@
         <w:pStyle w:val="ListBullet"/>
       </w:pPr>
       <w:r>
-        <w:t>openapi.yaml - спецификация OpenAPI 3.0 для импорта в Swagger, Postman или Insomnia;</w:t>
+        <w:t>api_reference.md - markdown-версия справочника API;</w:t>
       </w:r>
     </w:p>
     <w:p>
@@ -136,7 +136,15 @@
         <w:pStyle w:val="ListBullet"/>
       </w:pPr>
       <w:r>
-        <w:t>developer_documentation.zip - дополнительный архив HTML-документации по TypeScript-модулям.</w:t>
+        <w:t>openapi.yaml - спецификация OpenAPI 3.0;</w:t>
+      </w:r>
+    </w:p>
+    <w:p>
+      <w:pPr>
+        <w:pStyle w:val="ListBullet"/>
+      </w:pPr>
+      <w:r>
+        <w:t>developer_documentation.zip - архив с документацией разработчика.</w:t>
       </w:r>
     </w:p>
     <w:p>
@@ -236,7 +244,7 @@
           </w:tcPr>
           <w:p>
             <w:r>
-              <w:t>Служебные маршруты NextAuth</w:t>
+              <w:t>Маршруты NextAuth</w:t>
             </w:r>
           </w:p>
         </w:tc>
@@ -604,7 +612,7 @@
           </w:tcPr>
           <w:p>
             <w:r>
-              <w:t>Обработка выдачи цифрового товара</w:t>
+              <w:t>Обработка выдачи товара</w:t>
             </w:r>
           </w:p>
         </w:tc>
@@ -718,32 +726,53 @@
         <w:pStyle w:val="Heading2"/>
       </w:pPr>
       <w:r>
-        <w:t>Пример описания API</w:t>
+        <w:t>Пример HTML API-reference</w:t>
       </w:r>
     </w:p>
     <w:p>
       <w:r>
-        <w:t>Endpoint POST /api/auth/register используется для регистрации пользователя. В запросе передаются email, password и необязательное поле name. Сервер проверяет корректность данных, применяет rate limit, проверяет уникальность email, хеширует пароль и создает пользователя.</w:t>
+        <w:rPr>
+          <w:rFonts w:ascii="Courier New" w:hAnsi="Courier New"/>
+          <w:sz w:val="20"/>
+        </w:rPr>
+        <w:t>&lt;article class="endpoint"&gt;</w:t>
+        <w:br/>
+        <w:t xml:space="preserve">  &lt;div class="endpoint-head"&gt;</w:t>
+        <w:br/>
+        <w:t xml:space="preserve">    &lt;span class="method post"&gt;POST&lt;/span&gt;</w:t>
+        <w:br/>
+        <w:t xml:space="preserve">    &lt;span class="path"&gt;/api/auth/register&lt;/span&gt;</w:t>
+        <w:br/>
+        <w:t xml:space="preserve">    &lt;span class="access"&gt;Public, rate limited&lt;/span&gt;</w:t>
+        <w:br/>
+        <w:t xml:space="preserve">  &lt;/div&gt;</w:t>
+        <w:br/>
+        <w:t xml:space="preserve">  &lt;p&gt;Создает нового пользователя. Пароль хешируется перед сохранением.&lt;/p&gt;</w:t>
+        <w:br/>
+        <w:t xml:space="preserve">  &lt;pre&gt;{</w:t>
+        <w:br/>
+        <w:t xml:space="preserve">    "email": "user@example.com",</w:t>
+        <w:br/>
+        <w:t xml:space="preserve">    "password": "password123",</w:t>
+        <w:br/>
+        <w:t xml:space="preserve">    "name": "User"</w:t>
+        <w:br/>
+        <w:t xml:space="preserve">  }&lt;/pre&gt;</w:t>
+        <w:br/>
+        <w:t>&lt;/article&gt;</w:t>
+      </w:r>
+    </w:p>
+    <w:p>
+      <w:pPr>
+        <w:pStyle w:val="Heading1"/>
+      </w:pPr>
+      <w:r>
+        <w:t>Пользовательская документация</w:t>
       </w:r>
     </w:p>
     <w:p>
       <w:r>
-        <w:t>Пример request body:</w:t>
-      </w:r>
-    </w:p>
-    <w:p>
-      <w:r>
-        <w:t>{ "email": "user@example.com", "password": "password123", "name": "User" }</w:t>
-      </w:r>
-    </w:p>
-    <w:p>
-      <w:r>
-        <w:t>Пример успешного ответа:</w:t>
-      </w:r>
-    </w:p>
-    <w:p>
-      <w:r>
-        <w:t>{ "ok": true, "userId": "clx..." }</w:t>
+        <w:t>Пользовательская Wiki переделана без скриншотов. Вместо изображений в документации приведен HTML-код интерфейса и создан отдельный файл user_interface.html, который можно открыть в браузере как макет пользовательского интерфейса.</w:t>
       </w:r>
     </w:p>
     <w:p>
@@ -751,33 +780,7 @@
         <w:pStyle w:val="Heading2"/>
       </w:pPr>
       <w:r>
-        <w:t>Служебные API</w:t>
-      </w:r>
-    </w:p>
-    <w:p>
-      <w:r>
-        <w:t>Для фоновых задач используются защищенные endpoint /api/jobs/fulfill и /api/jobs/sync-digiseller. Доступ к ним выполняется только при передаче заголовка x-jobs-secret, значение которого должно совпадать с переменной окружения JOBS_SECRET.</w:t>
-      </w:r>
-    </w:p>
-    <w:p>
-      <w:pPr>
-        <w:pStyle w:val="Heading1"/>
-      </w:pPr>
-      <w:r>
-        <w:t>Документация пользователя</w:t>
-      </w:r>
-    </w:p>
-    <w:p>
-      <w:r>
-        <w:t>Пользовательская документация оформлена в формате GitHub Wiki. Она содержит не только текстовые инструкции, но и изображения интерфейса приложения: главный экран, верхнюю панель, поиск, карточки товаров, кнопки добавления в корзину и нижнюю часть страницы.</w:t>
-      </w:r>
-    </w:p>
-    <w:p>
-      <w:pPr>
-        <w:pStyle w:val="Heading2"/>
-      </w:pPr>
-      <w:r>
-        <w:t>Структура пользовательской Wiki</w:t>
+        <w:t>Файлы пользовательской Wiki</w:t>
       </w:r>
     </w:p>
     <w:tbl>
@@ -799,7 +802,7 @@
           </w:tcPr>
           <w:p>
             <w:r>
-              <w:t>Страница</w:t>
+              <w:t>Файл</w:t>
             </w:r>
           </w:p>
         </w:tc>
@@ -810,7 +813,7 @@
           </w:tcPr>
           <w:p>
             <w:r>
-              <w:t>Описание</w:t>
+              <w:t>Содержание</w:t>
             </w:r>
           </w:p>
         </w:tc>
@@ -834,7 +837,7 @@
           </w:tcPr>
           <w:p>
             <w:r>
-              <w:t>Главная страница Wiki с общим видом интерфейса.</w:t>
+              <w:t>Главная страница Wiki со ссылкой на HTML-интерфейс.</w:t>
             </w:r>
           </w:p>
         </w:tc>
@@ -858,7 +861,103 @@
           </w:tcPr>
           <w:p>
             <w:r>
-              <w:t>Обзор основных элементов пользовательского интерфейса.</w:t>
+              <w:t>HTML-код верхней панели, поиска, карточки товара и стилей.</w:t>
+            </w:r>
+          </w:p>
+        </w:tc>
+      </w:tr>
+      <w:tr>
+        <w:tc>
+          <w:tcPr>
+            <w:tcW w:type="dxa" w:w="4844"/>
+            <w:vAlign w:val="center"/>
+          </w:tcPr>
+          <w:p>
+            <w:r>
+              <w:t>user_interface.html</w:t>
+            </w:r>
+          </w:p>
+        </w:tc>
+        <w:tc>
+          <w:tcPr>
+            <w:tcW w:type="dxa" w:w="4844"/>
+            <w:vAlign w:val="center"/>
+          </w:tcPr>
+          <w:p>
+            <w:r>
+              <w:t>Полная HTML-страница пользовательского интерфейса.</w:t>
+            </w:r>
+          </w:p>
+        </w:tc>
+      </w:tr>
+      <w:tr>
+        <w:tc>
+          <w:tcPr>
+            <w:tcW w:type="dxa" w:w="4844"/>
+            <w:vAlign w:val="center"/>
+          </w:tcPr>
+          <w:p>
+            <w:r>
+              <w:t>Product-catalog.md</w:t>
+            </w:r>
+          </w:p>
+        </w:tc>
+        <w:tc>
+          <w:tcPr>
+            <w:tcW w:type="dxa" w:w="4844"/>
+            <w:vAlign w:val="center"/>
+          </w:tcPr>
+          <w:p>
+            <w:r>
+              <w:t>HTML-код каталога и карточки товара.</w:t>
+            </w:r>
+          </w:p>
+        </w:tc>
+      </w:tr>
+      <w:tr>
+        <w:tc>
+          <w:tcPr>
+            <w:tcW w:type="dxa" w:w="4844"/>
+            <w:vAlign w:val="center"/>
+          </w:tcPr>
+          <w:p>
+            <w:r>
+              <w:t>Cart.md</w:t>
+            </w:r>
+          </w:p>
+        </w:tc>
+        <w:tc>
+          <w:tcPr>
+            <w:tcW w:type="dxa" w:w="4844"/>
+            <w:vAlign w:val="center"/>
+          </w:tcPr>
+          <w:p>
+            <w:r>
+              <w:t>HTML-код кнопки корзины и добавления товара.</w:t>
+            </w:r>
+          </w:p>
+        </w:tc>
+      </w:tr>
+      <w:tr>
+        <w:tc>
+          <w:tcPr>
+            <w:tcW w:type="dxa" w:w="4844"/>
+            <w:vAlign w:val="center"/>
+          </w:tcPr>
+          <w:p>
+            <w:r>
+              <w:t>Checkout.md</w:t>
+            </w:r>
+          </w:p>
+        </w:tc>
+        <w:tc>
+          <w:tcPr>
+            <w:tcW w:type="dxa" w:w="4844"/>
+            <w:vAlign w:val="center"/>
+          </w:tcPr>
+          <w:p>
+            <w:r>
+              <w:t>HTML-код сценария оформления заказа.</w:t>
             </w:r>
           </w:p>
         </w:tc>
@@ -882,79 +981,7 @@
           </w:tcPr>
           <w:p>
             <w:r>
-              <w:t>Регистрация и вход пользователя.</w:t>
-            </w:r>
-          </w:p>
-        </w:tc>
-      </w:tr>
-      <w:tr>
-        <w:tc>
-          <w:tcPr>
-            <w:tcW w:type="dxa" w:w="4844"/>
-            <w:vAlign w:val="center"/>
-          </w:tcPr>
-          <w:p>
-            <w:r>
-              <w:t>Product-catalog.md</w:t>
-            </w:r>
-          </w:p>
-        </w:tc>
-        <w:tc>
-          <w:tcPr>
-            <w:tcW w:type="dxa" w:w="4844"/>
-            <w:vAlign w:val="center"/>
-          </w:tcPr>
-          <w:p>
-            <w:r>
-              <w:t>Каталог и карточки товаров.</w:t>
-            </w:r>
-          </w:p>
-        </w:tc>
-      </w:tr>
-      <w:tr>
-        <w:tc>
-          <w:tcPr>
-            <w:tcW w:type="dxa" w:w="4844"/>
-            <w:vAlign w:val="center"/>
-          </w:tcPr>
-          <w:p>
-            <w:r>
-              <w:t>Cart.md</w:t>
-            </w:r>
-          </w:p>
-        </w:tc>
-        <w:tc>
-          <w:tcPr>
-            <w:tcW w:type="dxa" w:w="4844"/>
-            <w:vAlign w:val="center"/>
-          </w:tcPr>
-          <w:p>
-            <w:r>
-              <w:t>Работа с корзиной.</w:t>
-            </w:r>
-          </w:p>
-        </w:tc>
-      </w:tr>
-      <w:tr>
-        <w:tc>
-          <w:tcPr>
-            <w:tcW w:type="dxa" w:w="4844"/>
-            <w:vAlign w:val="center"/>
-          </w:tcPr>
-          <w:p>
-            <w:r>
-              <w:t>Checkout.md</w:t>
-            </w:r>
-          </w:p>
-        </w:tc>
-        <w:tc>
-          <w:tcPr>
-            <w:tcW w:type="dxa" w:w="4844"/>
-            <w:vAlign w:val="center"/>
-          </w:tcPr>
-          <w:p>
-            <w:r>
-              <w:t>Оформление заказа.</w:t>
+              <w:t>HTML-код входа и регистрации.</w:t>
             </w:r>
           </w:p>
         </w:tc>
@@ -978,7 +1005,7 @@
           </w:tcPr>
           <w:p>
             <w:r>
-              <w:t>Просмотр статуса заказа.</w:t>
+              <w:t>HTML-код статуса заказа.</w:t>
             </w:r>
           </w:p>
         </w:tc>
@@ -1002,12 +1029,47 @@
           </w:tcPr>
           <w:p>
             <w:r>
-              <w:t>Описание административной панели.</w:t>
+              <w:t>HTML-код административной таблицы.</w:t>
             </w:r>
           </w:p>
         </w:tc>
       </w:tr>
     </w:tbl>
+    <w:p>
+      <w:pPr>
+        <w:pStyle w:val="Heading2"/>
+      </w:pPr>
+      <w:r>
+        <w:t>Пример HTML пользовательского интерфейса</w:t>
+      </w:r>
+    </w:p>
+    <w:p>
+      <w:r>
+        <w:rPr>
+          <w:rFonts w:ascii="Courier New" w:hAnsi="Courier New"/>
+          <w:sz w:val="20"/>
+        </w:rPr>
+        <w:t>&lt;section class="hero"&gt;</w:t>
+        <w:br/>
+        <w:t xml:space="preserve">  &lt;div class="panel"&gt;</w:t>
+        <w:br/>
+        <w:t xml:space="preserve">    &lt;span class="pill"&gt;Official supply - Processed via Digiseller&lt;/span&gt;</w:t>
+        <w:br/>
+        <w:t xml:space="preserve">    &lt;h1&gt;Official digital keys. Instant delivery.&lt;/h1&gt;</w:t>
+        <w:br/>
+        <w:t xml:space="preserve">    &lt;form class="search"&gt;</w:t>
+        <w:br/>
+        <w:t xml:space="preserve">      &lt;input type="search" placeholder="Search products..."&gt;</w:t>
+        <w:br/>
+        <w:t xml:space="preserve">      &lt;button class="button primary" type="submit"&gt;Search&lt;/button&gt;</w:t>
+        <w:br/>
+        <w:t xml:space="preserve">    &lt;/form&gt;</w:t>
+        <w:br/>
+        <w:t xml:space="preserve">  &lt;/div&gt;</w:t>
+        <w:br/>
+        <w:t>&lt;/section&gt;</w:t>
+      </w:r>
+    </w:p>
     <w:p>
       <w:pPr>
         <w:pStyle w:val="Heading1"/>
@@ -1021,7 +1083,7 @@
         <w:pStyle w:val="ListNumber"/>
       </w:pPr>
       <w:r>
-        <w:t>Пользователь открывает главную страницу приложения.</w:t>
+        <w:t>Пользователь открывает HTML-интерфейс магазина.</w:t>
       </w:r>
     </w:p>
     <w:p>
@@ -1029,7 +1091,7 @@
         <w:pStyle w:val="ListNumber"/>
       </w:pPr>
       <w:r>
-        <w:t>Через поиск или каталог выбирает цифровой товар.</w:t>
+        <w:t>Через поисковую строку или каталог выбирает цифровой товар.</w:t>
       </w:r>
     </w:p>
     <w:p>
@@ -1037,7 +1099,7 @@
         <w:pStyle w:val="ListNumber"/>
       </w:pPr>
       <w:r>
-        <w:t>Открывает карточку товара или сразу добавляет товар в корзину.</w:t>
+        <w:t>Нажимает Details для просмотра товара или Add to cart для добавления в корзину.</w:t>
       </w:r>
     </w:p>
     <w:p>
@@ -1045,7 +1107,7 @@
         <w:pStyle w:val="ListNumber"/>
       </w:pPr>
       <w:r>
-        <w:t>Переходит в корзину и проверяет состав заказа.</w:t>
+        <w:t>Переходит к оформлению заказа.</w:t>
       </w:r>
     </w:p>
     <w:p>
@@ -1053,7 +1115,7 @@
         <w:pStyle w:val="ListNumber"/>
       </w:pPr>
       <w:r>
-        <w:t>Оформляет заказ и переходит к оплате через Digiseller.</w:t>
+        <w:t>Оплачивает заказ через Digiseller.</w:t>
       </w:r>
     </w:p>
     <w:p>
@@ -1061,235 +1123,7 @@
         <w:pStyle w:val="ListNumber"/>
       </w:pPr>
       <w:r>
-        <w:t>После оплаты возвращается на страницу заказа и получает цифровой товар.</w:t>
-      </w:r>
-    </w:p>
-    <w:p>
-      <w:pPr>
-        <w:pStyle w:val="Heading1"/>
-      </w:pPr>
-      <w:r>
-        <w:t>Приложение. Интерфейс пользователя</w:t>
-      </w:r>
-    </w:p>
-    <w:p>
-      <w:pPr>
-        <w:pStyle w:val="Heading2"/>
-      </w:pPr>
-      <w:r>
-        <w:t>Главная страница</w:t>
-      </w:r>
-    </w:p>
-    <w:p>
-      <w:pPr>
-        <w:jc w:val="center"/>
-      </w:pPr>
-      <w:r>
-        <w:drawing>
-          <wp:inline xmlns:a="http://schemas.openxmlformats.org/drawingml/2006/main" xmlns:pic="http://schemas.openxmlformats.org/drawingml/2006/picture">
-            <wp:extent cx="5400000" cy="11781818"/>
-            <wp:docPr id="1" name="Picture 1"/>
-            <wp:cNvGraphicFramePr>
-              <a:graphicFrameLocks noChangeAspect="1"/>
-            </wp:cNvGraphicFramePr>
-            <a:graphic>
-              <a:graphicData uri="http://schemas.openxmlformats.org/drawingml/2006/picture">
-                <pic:pic>
-                  <pic:nvPicPr>
-                    <pic:cNvPr id="0" name="interface-home.png"/>
-                    <pic:cNvPicPr/>
-                  </pic:nvPicPr>
-                  <pic:blipFill>
-                    <a:blip r:embed="rId9"/>
-                    <a:stretch>
-                      <a:fillRect/>
-                    </a:stretch>
-                  </pic:blipFill>
-                  <pic:spPr>
-                    <a:xfrm>
-                      <a:off x="0" y="0"/>
-                      <a:ext cx="5400000" cy="11781818"/>
-                    </a:xfrm>
-                    <a:prstGeom prst="rect"/>
-                  </pic:spPr>
-                </pic:pic>
-              </a:graphicData>
-            </a:graphic>
-          </wp:inline>
-        </w:drawing>
-      </w:r>
-    </w:p>
-    <w:p>
-      <w:pPr>
-        <w:jc w:val="center"/>
-      </w:pPr>
-      <w:r>
-        <w:t>Общий вид главной страницы с поиском, навигацией, преимуществами и карточками товаров.</w:t>
-      </w:r>
-    </w:p>
-    <w:p>
-      <w:pPr>
-        <w:pStyle w:val="Heading2"/>
-      </w:pPr>
-      <w:r>
-        <w:t>Основные элементы интерфейса</w:t>
-      </w:r>
-    </w:p>
-    <w:p>
-      <w:pPr>
-        <w:jc w:val="center"/>
-      </w:pPr>
-      <w:r>
-        <w:drawing>
-          <wp:inline xmlns:a="http://schemas.openxmlformats.org/drawingml/2006/main" xmlns:pic="http://schemas.openxmlformats.org/drawingml/2006/picture">
-            <wp:extent cx="5400000" cy="4686248"/>
-            <wp:docPr id="2" name="Picture 2"/>
-            <wp:cNvGraphicFramePr>
-              <a:graphicFrameLocks noChangeAspect="1"/>
-            </wp:cNvGraphicFramePr>
-            <a:graphic>
-              <a:graphicData uri="http://schemas.openxmlformats.org/drawingml/2006/picture">
-                <pic:pic>
-                  <pic:nvPicPr>
-                    <pic:cNvPr id="0" name="interface-annotated-overview.png"/>
-                    <pic:cNvPicPr/>
-                  </pic:nvPicPr>
-                  <pic:blipFill>
-                    <a:blip r:embed="rId10"/>
-                    <a:stretch>
-                      <a:fillRect/>
-                    </a:stretch>
-                  </pic:blipFill>
-                  <pic:spPr>
-                    <a:xfrm>
-                      <a:off x="0" y="0"/>
-                      <a:ext cx="5400000" cy="4686248"/>
-                    </a:xfrm>
-                    <a:prstGeom prst="rect"/>
-                  </pic:spPr>
-                </pic:pic>
-              </a:graphicData>
-            </a:graphic>
-          </wp:inline>
-        </w:drawing>
-      </w:r>
-    </w:p>
-    <w:p>
-      <w:pPr>
-        <w:jc w:val="center"/>
-      </w:pPr>
-      <w:r>
-        <w:t>Аннотированный вид интерфейса: поиск, корзина, переключение языка и карточки товаров.</w:t>
-      </w:r>
-    </w:p>
-    <w:p>
-      <w:pPr>
-        <w:pStyle w:val="Heading2"/>
-      </w:pPr>
-      <w:r>
-        <w:t>Верхняя панель</w:t>
-      </w:r>
-    </w:p>
-    <w:p>
-      <w:pPr>
-        <w:jc w:val="center"/>
-      </w:pPr>
-      <w:r>
-        <w:drawing>
-          <wp:inline xmlns:a="http://schemas.openxmlformats.org/drawingml/2006/main" xmlns:pic="http://schemas.openxmlformats.org/drawingml/2006/picture">
-            <wp:extent cx="5400000" cy="254571"/>
-            <wp:docPr id="3" name="Picture 3"/>
-            <wp:cNvGraphicFramePr>
-              <a:graphicFrameLocks noChangeAspect="1"/>
-            </wp:cNvGraphicFramePr>
-            <a:graphic>
-              <a:graphicData uri="http://schemas.openxmlformats.org/drawingml/2006/picture">
-                <pic:pic>
-                  <pic:nvPicPr>
-                    <pic:cNvPr id="0" name="interface-header.png"/>
-                    <pic:cNvPicPr/>
-                  </pic:nvPicPr>
-                  <pic:blipFill>
-                    <a:blip r:embed="rId11"/>
-                    <a:stretch>
-                      <a:fillRect/>
-                    </a:stretch>
-                  </pic:blipFill>
-                  <pic:spPr>
-                    <a:xfrm>
-                      <a:off x="0" y="0"/>
-                      <a:ext cx="5400000" cy="254571"/>
-                    </a:xfrm>
-                    <a:prstGeom prst="rect"/>
-                  </pic:spPr>
-                </pic:pic>
-              </a:graphicData>
-            </a:graphic>
-          </wp:inline>
-        </w:drawing>
-      </w:r>
-    </w:p>
-    <w:p>
-      <w:pPr>
-        <w:jc w:val="center"/>
-      </w:pPr>
-      <w:r>
-        <w:t>Навигация, переключение языка, корзина, вход и регистрация.</w:t>
-      </w:r>
-    </w:p>
-    <w:p>
-      <w:pPr>
-        <w:pStyle w:val="Heading2"/>
-      </w:pPr>
-      <w:r>
-        <w:t>Карточки товаров</w:t>
-      </w:r>
-    </w:p>
-    <w:p>
-      <w:pPr>
-        <w:jc w:val="center"/>
-      </w:pPr>
-      <w:r>
-        <w:drawing>
-          <wp:inline xmlns:a="http://schemas.openxmlformats.org/drawingml/2006/main" xmlns:pic="http://schemas.openxmlformats.org/drawingml/2006/picture">
-            <wp:extent cx="5400000" cy="4251969"/>
-            <wp:docPr id="4" name="Picture 4"/>
-            <wp:cNvGraphicFramePr>
-              <a:graphicFrameLocks noChangeAspect="1"/>
-            </wp:cNvGraphicFramePr>
-            <a:graphic>
-              <a:graphicData uri="http://schemas.openxmlformats.org/drawingml/2006/picture">
-                <pic:pic>
-                  <pic:nvPicPr>
-                    <pic:cNvPr id="0" name="interface-product-cards.png"/>
-                    <pic:cNvPicPr/>
-                  </pic:nvPicPr>
-                  <pic:blipFill>
-                    <a:blip r:embed="rId12"/>
-                    <a:stretch>
-                      <a:fillRect/>
-                    </a:stretch>
-                  </pic:blipFill>
-                  <pic:spPr>
-                    <a:xfrm>
-                      <a:off x="0" y="0"/>
-                      <a:ext cx="5400000" cy="4251969"/>
-                    </a:xfrm>
-                    <a:prstGeom prst="rect"/>
-                  </pic:spPr>
-                </pic:pic>
-              </a:graphicData>
-            </a:graphic>
-          </wp:inline>
-        </w:drawing>
-      </w:r>
-    </w:p>
-    <w:p>
-      <w:pPr>
-        <w:jc w:val="center"/>
-      </w:pPr>
-      <w:r>
-        <w:t>Карточки с изображением, ценой, названием и кнопками Details/Add to cart.</w:t>
+        <w:t>После подтверждения платежа получает цифровой товар на странице заказа.</w:t>
       </w:r>
     </w:p>
     <w:p>
@@ -1320,7 +1154,7 @@
     </w:p>
     <w:p>
       <w:r>
-        <w:t>В ходе практической работы была подготовлена документация разработчика в виде API-reference и OpenAPI-спецификации, а также пользовательская Wiki-документация с изображениями интерфейса. Такая структура помогает разработчикам понимать серверные интерфейсы системы, а пользователям - выполнять основные действия в приложении.</w:t>
+        <w:t>В ходе практической работы документация была приведена к требуемому виду: документация разработчика оформлена как HTML/API-reference, а пользовательская Wiki содержит HTML-код интерфейса вместо скриншотов. Это делает материалы более пригодными для проверки, повторного использования и публикации в репозитории.</w:t>
       </w:r>
     </w:p>
     <w:sectPr>

</xml_diff>

<commit_message>
Add rendered HTML pages for user wiki
</commit_message>
<xml_diff>
--- a/reports/Практическая_работа_10_Документирование_ПО.docx
+++ b/reports/Практическая_работа_10_Документирование_ПО.docx
@@ -78,20 +78,7 @@
     </w:p>
     <w:p>
       <w:r>
-        <w:t>Создать документацию разработчика и пользовательскую документацию для проекта Legal Store. Документация разработчика оформляется как HTML/API-reference, а пользовательская документация содержит HTML-код основных элементов интерфейса.</w:t>
-      </w:r>
-    </w:p>
-    <w:p>
-      <w:pPr>
-        <w:pStyle w:val="Heading1"/>
-      </w:pPr>
-      <w:r>
-        <w:t>Описание проекта</w:t>
-      </w:r>
-    </w:p>
-    <w:p>
-      <w:r>
-        <w:t>Legal Store - веб-приложение интернет-магазина цифровых товаров и лицензионных ключей. Система содержит каталог товаров, корзину, оформление заказа, интеграцию с Digiseller, избранное и авторизацию пользователей.</w:t>
+        <w:t>Создать документацию разработчика и пользователя. Документация разработчика оформлена как HTML API-reference. Пользовательская документация оформлена как Wiki-навигация и набор отдельных HTML-страниц интерфейса со встроенным CSS.</w:t>
       </w:r>
     </w:p>
     <w:p>
@@ -104,683 +91,7 @@
     </w:p>
     <w:p>
       <w:r>
-        <w:t>Документация разработчика подготовлена в формате API-reference. Для удобства чтения создана отдельная HTML-страница api_reference.html, а для импорта в инструменты разработки подготовлена спецификация OpenAPI 3.0.</w:t>
-      </w:r>
-    </w:p>
-    <w:p>
-      <w:pPr>
-        <w:pStyle w:val="Heading2"/>
-      </w:pPr>
-      <w:r>
-        <w:t>Файлы документации разработчика</w:t>
-      </w:r>
-    </w:p>
-    <w:p>
-      <w:pPr>
-        <w:pStyle w:val="ListBullet"/>
-      </w:pPr>
-      <w:r>
-        <w:t>api_reference.html - HTML-страница со справочником API;</w:t>
-      </w:r>
-    </w:p>
-    <w:p>
-      <w:pPr>
-        <w:pStyle w:val="ListBullet"/>
-      </w:pPr>
-      <w:r>
-        <w:t>api_reference.md - markdown-версия справочника API;</w:t>
-      </w:r>
-    </w:p>
-    <w:p>
-      <w:pPr>
-        <w:pStyle w:val="ListBullet"/>
-      </w:pPr>
-      <w:r>
-        <w:t>openapi.yaml - спецификация OpenAPI 3.0;</w:t>
-      </w:r>
-    </w:p>
-    <w:p>
-      <w:pPr>
-        <w:pStyle w:val="ListBullet"/>
-      </w:pPr>
-      <w:r>
-        <w:t>developer_documentation.zip - архив с документацией разработчика.</w:t>
-      </w:r>
-    </w:p>
-    <w:p>
-      <w:pPr>
-        <w:pStyle w:val="Heading2"/>
-      </w:pPr>
-      <w:r>
-        <w:t>Основные API проекта</w:t>
-      </w:r>
-    </w:p>
-    <w:tbl>
-      <w:tblPr>
-        <w:tblStyle w:val="TableGrid"/>
-        <w:tblW w:type="auto" w:w="0"/>
-        <w:jc w:val="center"/>
-        <w:tblLook w:firstColumn="1" w:firstRow="1" w:lastColumn="0" w:lastRow="0" w:noHBand="0" w:noVBand="1" w:val="04A0"/>
-      </w:tblPr>
-      <w:tblGrid>
-        <w:gridCol w:w="2422"/>
-        <w:gridCol w:w="2422"/>
-        <w:gridCol w:w="2422"/>
-        <w:gridCol w:w="2422"/>
-      </w:tblGrid>
-      <w:tr>
-        <w:tc>
-          <w:tcPr>
-            <w:tcW w:type="dxa" w:w="2422"/>
-            <w:vAlign w:val="center"/>
-          </w:tcPr>
-          <w:p>
-            <w:r>
-              <w:t>Метод</w:t>
-            </w:r>
-          </w:p>
-        </w:tc>
-        <w:tc>
-          <w:tcPr>
-            <w:tcW w:type="dxa" w:w="2422"/>
-            <w:vAlign w:val="center"/>
-          </w:tcPr>
-          <w:p>
-            <w:r>
-              <w:t>Endpoint</w:t>
-            </w:r>
-          </w:p>
-        </w:tc>
-        <w:tc>
-          <w:tcPr>
-            <w:tcW w:type="dxa" w:w="2422"/>
-            <w:vAlign w:val="center"/>
-          </w:tcPr>
-          <w:p>
-            <w:r>
-              <w:t>Назначение</w:t>
-            </w:r>
-          </w:p>
-        </w:tc>
-        <w:tc>
-          <w:tcPr>
-            <w:tcW w:type="dxa" w:w="2422"/>
-            <w:vAlign w:val="center"/>
-          </w:tcPr>
-          <w:p>
-            <w:r>
-              <w:t>Доступ</w:t>
-            </w:r>
-          </w:p>
-        </w:tc>
-      </w:tr>
-      <w:tr>
-        <w:tc>
-          <w:tcPr>
-            <w:tcW w:type="dxa" w:w="2422"/>
-            <w:vAlign w:val="center"/>
-          </w:tcPr>
-          <w:p>
-            <w:r>
-              <w:t>GET/POST</w:t>
-            </w:r>
-          </w:p>
-        </w:tc>
-        <w:tc>
-          <w:tcPr>
-            <w:tcW w:type="dxa" w:w="2422"/>
-            <w:vAlign w:val="center"/>
-          </w:tcPr>
-          <w:p>
-            <w:r>
-              <w:t>/api/auth/[...nextauth]</w:t>
-            </w:r>
-          </w:p>
-        </w:tc>
-        <w:tc>
-          <w:tcPr>
-            <w:tcW w:type="dxa" w:w="2422"/>
-            <w:vAlign w:val="center"/>
-          </w:tcPr>
-          <w:p>
-            <w:r>
-              <w:t>Маршруты NextAuth</w:t>
-            </w:r>
-          </w:p>
-        </w:tc>
-        <w:tc>
-          <w:tcPr>
-            <w:tcW w:type="dxa" w:w="2422"/>
-            <w:vAlign w:val="center"/>
-          </w:tcPr>
-          <w:p>
-            <w:r>
-              <w:t>Публичный/сессионный</w:t>
-            </w:r>
-          </w:p>
-        </w:tc>
-      </w:tr>
-      <w:tr>
-        <w:tc>
-          <w:tcPr>
-            <w:tcW w:type="dxa" w:w="2422"/>
-            <w:vAlign w:val="center"/>
-          </w:tcPr>
-          <w:p>
-            <w:r>
-              <w:t>POST</w:t>
-            </w:r>
-          </w:p>
-        </w:tc>
-        <w:tc>
-          <w:tcPr>
-            <w:tcW w:type="dxa" w:w="2422"/>
-            <w:vAlign w:val="center"/>
-          </w:tcPr>
-          <w:p>
-            <w:r>
-              <w:t>/api/auth/register</w:t>
-            </w:r>
-          </w:p>
-        </w:tc>
-        <w:tc>
-          <w:tcPr>
-            <w:tcW w:type="dxa" w:w="2422"/>
-            <w:vAlign w:val="center"/>
-          </w:tcPr>
-          <w:p>
-            <w:r>
-              <w:t>Регистрация пользователя</w:t>
-            </w:r>
-          </w:p>
-        </w:tc>
-        <w:tc>
-          <w:tcPr>
-            <w:tcW w:type="dxa" w:w="2422"/>
-            <w:vAlign w:val="center"/>
-          </w:tcPr>
-          <w:p>
-            <w:r>
-              <w:t>Публичный</w:t>
-            </w:r>
-          </w:p>
-        </w:tc>
-      </w:tr>
-      <w:tr>
-        <w:tc>
-          <w:tcPr>
-            <w:tcW w:type="dxa" w:w="2422"/>
-            <w:vAlign w:val="center"/>
-          </w:tcPr>
-          <w:p>
-            <w:r>
-              <w:t>POST</w:t>
-            </w:r>
-          </w:p>
-        </w:tc>
-        <w:tc>
-          <w:tcPr>
-            <w:tcW w:type="dxa" w:w="2422"/>
-            <w:vAlign w:val="center"/>
-          </w:tcPr>
-          <w:p>
-            <w:r>
-              <w:t>/api/checkout/create-payment</w:t>
-            </w:r>
-          </w:p>
-        </w:tc>
-        <w:tc>
-          <w:tcPr>
-            <w:tcW w:type="dxa" w:w="2422"/>
-            <w:vAlign w:val="center"/>
-          </w:tcPr>
-          <w:p>
-            <w:r>
-              <w:t>Создание заказа и ссылки оплаты</w:t>
-            </w:r>
-          </w:p>
-        </w:tc>
-        <w:tc>
-          <w:tcPr>
-            <w:tcW w:type="dxa" w:w="2422"/>
-            <w:vAlign w:val="center"/>
-          </w:tcPr>
-          <w:p>
-            <w:r>
-              <w:t>Публичный/сессионный</w:t>
-            </w:r>
-          </w:p>
-        </w:tc>
-      </w:tr>
-      <w:tr>
-        <w:tc>
-          <w:tcPr>
-            <w:tcW w:type="dxa" w:w="2422"/>
-            <w:vAlign w:val="center"/>
-          </w:tcPr>
-          <w:p>
-            <w:r>
-              <w:t>POST</w:t>
-            </w:r>
-          </w:p>
-        </w:tc>
-        <w:tc>
-          <w:tcPr>
-            <w:tcW w:type="dxa" w:w="2422"/>
-            <w:vAlign w:val="center"/>
-          </w:tcPr>
-          <w:p>
-            <w:r>
-              <w:t>/api/digiseller/callback</w:t>
-            </w:r>
-          </w:p>
-        </w:tc>
-        <w:tc>
-          <w:tcPr>
-            <w:tcW w:type="dxa" w:w="2422"/>
-            <w:vAlign w:val="center"/>
-          </w:tcPr>
-          <w:p>
-            <w:r>
-              <w:t>Webhook подтверждения оплаты</w:t>
-            </w:r>
-          </w:p>
-        </w:tc>
-        <w:tc>
-          <w:tcPr>
-            <w:tcW w:type="dxa" w:w="2422"/>
-            <w:vAlign w:val="center"/>
-          </w:tcPr>
-          <w:p>
-            <w:r>
-              <w:t>Digiseller</w:t>
-            </w:r>
-          </w:p>
-        </w:tc>
-      </w:tr>
-      <w:tr>
-        <w:tc>
-          <w:tcPr>
-            <w:tcW w:type="dxa" w:w="2422"/>
-            <w:vAlign w:val="center"/>
-          </w:tcPr>
-          <w:p>
-            <w:r>
-              <w:t>GET</w:t>
-            </w:r>
-          </w:p>
-        </w:tc>
-        <w:tc>
-          <w:tcPr>
-            <w:tcW w:type="dxa" w:w="2422"/>
-            <w:vAlign w:val="center"/>
-          </w:tcPr>
-          <w:p>
-            <w:r>
-              <w:t>/api/digiseller/return</w:t>
-            </w:r>
-          </w:p>
-        </w:tc>
-        <w:tc>
-          <w:tcPr>
-            <w:tcW w:type="dxa" w:w="2422"/>
-            <w:vAlign w:val="center"/>
-          </w:tcPr>
-          <w:p>
-            <w:r>
-              <w:t>Возврат пользователя после оплаты</w:t>
-            </w:r>
-          </w:p>
-        </w:tc>
-        <w:tc>
-          <w:tcPr>
-            <w:tcW w:type="dxa" w:w="2422"/>
-            <w:vAlign w:val="center"/>
-          </w:tcPr>
-          <w:p>
-            <w:r>
-              <w:t>Публичный</w:t>
-            </w:r>
-          </w:p>
-        </w:tc>
-      </w:tr>
-      <w:tr>
-        <w:tc>
-          <w:tcPr>
-            <w:tcW w:type="dxa" w:w="2422"/>
-            <w:vAlign w:val="center"/>
-          </w:tcPr>
-          <w:p>
-            <w:r>
-              <w:t>GET</w:t>
-            </w:r>
-          </w:p>
-        </w:tc>
-        <w:tc>
-          <w:tcPr>
-            <w:tcW w:type="dxa" w:w="2422"/>
-            <w:vAlign w:val="center"/>
-          </w:tcPr>
-          <w:p>
-            <w:r>
-              <w:t>/api/favorites</w:t>
-            </w:r>
-          </w:p>
-        </w:tc>
-        <w:tc>
-          <w:tcPr>
-            <w:tcW w:type="dxa" w:w="2422"/>
-            <w:vAlign w:val="center"/>
-          </w:tcPr>
-          <w:p>
-            <w:r>
-              <w:t>Получение избранного</w:t>
-            </w:r>
-          </w:p>
-        </w:tc>
-        <w:tc>
-          <w:tcPr>
-            <w:tcW w:type="dxa" w:w="2422"/>
-            <w:vAlign w:val="center"/>
-          </w:tcPr>
-          <w:p>
-            <w:r>
-              <w:t>Авторизованный пользователь</w:t>
-            </w:r>
-          </w:p>
-        </w:tc>
-      </w:tr>
-      <w:tr>
-        <w:tc>
-          <w:tcPr>
-            <w:tcW w:type="dxa" w:w="2422"/>
-            <w:vAlign w:val="center"/>
-          </w:tcPr>
-          <w:p>
-            <w:r>
-              <w:t>POST</w:t>
-            </w:r>
-          </w:p>
-        </w:tc>
-        <w:tc>
-          <w:tcPr>
-            <w:tcW w:type="dxa" w:w="2422"/>
-            <w:vAlign w:val="center"/>
-          </w:tcPr>
-          <w:p>
-            <w:r>
-              <w:t>/api/favorites/toggle</w:t>
-            </w:r>
-          </w:p>
-        </w:tc>
-        <w:tc>
-          <w:tcPr>
-            <w:tcW w:type="dxa" w:w="2422"/>
-            <w:vAlign w:val="center"/>
-          </w:tcPr>
-          <w:p>
-            <w:r>
-              <w:t>Переключение избранного</w:t>
-            </w:r>
-          </w:p>
-        </w:tc>
-        <w:tc>
-          <w:tcPr>
-            <w:tcW w:type="dxa" w:w="2422"/>
-            <w:vAlign w:val="center"/>
-          </w:tcPr>
-          <w:p>
-            <w:r>
-              <w:t>Авторизованный пользователь</w:t>
-            </w:r>
-          </w:p>
-        </w:tc>
-      </w:tr>
-      <w:tr>
-        <w:tc>
-          <w:tcPr>
-            <w:tcW w:type="dxa" w:w="2422"/>
-            <w:vAlign w:val="center"/>
-          </w:tcPr>
-          <w:p>
-            <w:r>
-              <w:t>POST</w:t>
-            </w:r>
-          </w:p>
-        </w:tc>
-        <w:tc>
-          <w:tcPr>
-            <w:tcW w:type="dxa" w:w="2422"/>
-            <w:vAlign w:val="center"/>
-          </w:tcPr>
-          <w:p>
-            <w:r>
-              <w:t>/api/favorites/sync</w:t>
-            </w:r>
-          </w:p>
-        </w:tc>
-        <w:tc>
-          <w:tcPr>
-            <w:tcW w:type="dxa" w:w="2422"/>
-            <w:vAlign w:val="center"/>
-          </w:tcPr>
-          <w:p>
-            <w:r>
-              <w:t>Синхронизация избранного</w:t>
-            </w:r>
-          </w:p>
-        </w:tc>
-        <w:tc>
-          <w:tcPr>
-            <w:tcW w:type="dxa" w:w="2422"/>
-            <w:vAlign w:val="center"/>
-          </w:tcPr>
-          <w:p>
-            <w:r>
-              <w:t>Авторизованный пользователь</w:t>
-            </w:r>
-          </w:p>
-        </w:tc>
-      </w:tr>
-      <w:tr>
-        <w:tc>
-          <w:tcPr>
-            <w:tcW w:type="dxa" w:w="2422"/>
-            <w:vAlign w:val="center"/>
-          </w:tcPr>
-          <w:p>
-            <w:r>
-              <w:t>POST</w:t>
-            </w:r>
-          </w:p>
-        </w:tc>
-        <w:tc>
-          <w:tcPr>
-            <w:tcW w:type="dxa" w:w="2422"/>
-            <w:vAlign w:val="center"/>
-          </w:tcPr>
-          <w:p>
-            <w:r>
-              <w:t>/api/jobs/fulfill</w:t>
-            </w:r>
-          </w:p>
-        </w:tc>
-        <w:tc>
-          <w:tcPr>
-            <w:tcW w:type="dxa" w:w="2422"/>
-            <w:vAlign w:val="center"/>
-          </w:tcPr>
-          <w:p>
-            <w:r>
-              <w:t>Обработка выдачи товара</w:t>
-            </w:r>
-          </w:p>
-        </w:tc>
-        <w:tc>
-          <w:tcPr>
-            <w:tcW w:type="dxa" w:w="2422"/>
-            <w:vAlign w:val="center"/>
-          </w:tcPr>
-          <w:p>
-            <w:r>
-              <w:t>Служебный</w:t>
-            </w:r>
-          </w:p>
-        </w:tc>
-      </w:tr>
-      <w:tr>
-        <w:tc>
-          <w:tcPr>
-            <w:tcW w:type="dxa" w:w="2422"/>
-            <w:vAlign w:val="center"/>
-          </w:tcPr>
-          <w:p>
-            <w:r>
-              <w:t>POST</w:t>
-            </w:r>
-          </w:p>
-        </w:tc>
-        <w:tc>
-          <w:tcPr>
-            <w:tcW w:type="dxa" w:w="2422"/>
-            <w:vAlign w:val="center"/>
-          </w:tcPr>
-          <w:p>
-            <w:r>
-              <w:t>/api/jobs/sync-digiseller</w:t>
-            </w:r>
-          </w:p>
-        </w:tc>
-        <w:tc>
-          <w:tcPr>
-            <w:tcW w:type="dxa" w:w="2422"/>
-            <w:vAlign w:val="center"/>
-          </w:tcPr>
-          <w:p>
-            <w:r>
-              <w:t>Синхронизация Digiseller</w:t>
-            </w:r>
-          </w:p>
-        </w:tc>
-        <w:tc>
-          <w:tcPr>
-            <w:tcW w:type="dxa" w:w="2422"/>
-            <w:vAlign w:val="center"/>
-          </w:tcPr>
-          <w:p>
-            <w:r>
-              <w:t>Служебный</w:t>
-            </w:r>
-          </w:p>
-        </w:tc>
-      </w:tr>
-      <w:tr>
-        <w:tc>
-          <w:tcPr>
-            <w:tcW w:type="dxa" w:w="2422"/>
-            <w:vAlign w:val="center"/>
-          </w:tcPr>
-          <w:p>
-            <w:r>
-              <w:t>POST</w:t>
-            </w:r>
-          </w:p>
-        </w:tc>
-        <w:tc>
-          <w:tcPr>
-            <w:tcW w:type="dxa" w:w="2422"/>
-            <w:vAlign w:val="center"/>
-          </w:tcPr>
-          <w:p>
-            <w:r>
-              <w:t>/api/locale</w:t>
-            </w:r>
-          </w:p>
-        </w:tc>
-        <w:tc>
-          <w:tcPr>
-            <w:tcW w:type="dxa" w:w="2422"/>
-            <w:vAlign w:val="center"/>
-          </w:tcPr>
-          <w:p>
-            <w:r>
-              <w:t>Смена языка интерфейса</w:t>
-            </w:r>
-          </w:p>
-        </w:tc>
-        <w:tc>
-          <w:tcPr>
-            <w:tcW w:type="dxa" w:w="2422"/>
-            <w:vAlign w:val="center"/>
-          </w:tcPr>
-          <w:p>
-            <w:r>
-              <w:t>Публичный</w:t>
-            </w:r>
-          </w:p>
-        </w:tc>
-      </w:tr>
-    </w:tbl>
-    <w:p>
-      <w:pPr>
-        <w:pStyle w:val="Heading2"/>
-      </w:pPr>
-      <w:r>
-        <w:t>Пример HTML API-reference</w:t>
-      </w:r>
-    </w:p>
-    <w:p>
-      <w:r>
-        <w:rPr>
-          <w:rFonts w:ascii="Courier New" w:hAnsi="Courier New"/>
-          <w:sz w:val="20"/>
-        </w:rPr>
-        <w:t>&lt;article class="endpoint"&gt;</w:t>
-        <w:br/>
-        <w:t xml:space="preserve">  &lt;div class="endpoint-head"&gt;</w:t>
-        <w:br/>
-        <w:t xml:space="preserve">    &lt;span class="method post"&gt;POST&lt;/span&gt;</w:t>
-        <w:br/>
-        <w:t xml:space="preserve">    &lt;span class="path"&gt;/api/auth/register&lt;/span&gt;</w:t>
-        <w:br/>
-        <w:t xml:space="preserve">    &lt;span class="access"&gt;Public, rate limited&lt;/span&gt;</w:t>
-        <w:br/>
-        <w:t xml:space="preserve">  &lt;/div&gt;</w:t>
-        <w:br/>
-        <w:t xml:space="preserve">  &lt;p&gt;Создает нового пользователя. Пароль хешируется перед сохранением.&lt;/p&gt;</w:t>
-        <w:br/>
-        <w:t xml:space="preserve">  &lt;pre&gt;{</w:t>
-        <w:br/>
-        <w:t xml:space="preserve">    "email": "user@example.com",</w:t>
-        <w:br/>
-        <w:t xml:space="preserve">    "password": "password123",</w:t>
-        <w:br/>
-        <w:t xml:space="preserve">    "name": "User"</w:t>
-        <w:br/>
-        <w:t xml:space="preserve">  }&lt;/pre&gt;</w:t>
-        <w:br/>
-        <w:t>&lt;/article&gt;</w:t>
-      </w:r>
-    </w:p>
-    <w:p>
-      <w:pPr>
-        <w:pStyle w:val="Heading1"/>
-      </w:pPr>
-      <w:r>
-        <w:t>Пользовательская документация</w:t>
-      </w:r>
-    </w:p>
-    <w:p>
-      <w:r>
-        <w:t>Пользовательская Wiki переделана без скриншотов. Вместо изображений в документации приведен HTML-код интерфейса и создан отдельный файл user_interface.html, который можно открыть в браузере как макет пользовательского интерфейса.</w:t>
-      </w:r>
-    </w:p>
-    <w:p>
-      <w:pPr>
-        <w:pStyle w:val="Heading2"/>
-      </w:pPr>
-      <w:r>
-        <w:t>Файлы пользовательской Wiki</w:t>
+        <w:t>Для разработчика подготовлена HTML-страница api_reference.html. Она содержит таблицу API, карточки endpoint, примеры JSON-запросов и ответов, а также информацию об авторизации и служебных заголовках.</w:t>
       </w:r>
     </w:p>
     <w:tbl>
@@ -813,7 +124,7 @@
           </w:tcPr>
           <w:p>
             <w:r>
-              <w:t>Содержание</w:t>
+              <w:t>Назначение</w:t>
             </w:r>
           </w:p>
         </w:tc>
@@ -826,7 +137,7 @@
           </w:tcPr>
           <w:p>
             <w:r>
-              <w:t>Home.md</w:t>
+              <w:t>api_reference.html</w:t>
             </w:r>
           </w:p>
         </w:tc>
@@ -837,7 +148,7 @@
           </w:tcPr>
           <w:p>
             <w:r>
-              <w:t>Главная страница Wiki со ссылкой на HTML-интерфейс.</w:t>
+              <w:t>Визуальный API-reference для открытия в браузере.</w:t>
             </w:r>
           </w:p>
         </w:tc>
@@ -850,7 +161,7 @@
           </w:tcPr>
           <w:p>
             <w:r>
-              <w:t>User-interface.md</w:t>
+              <w:t>api_reference.md</w:t>
             </w:r>
           </w:p>
         </w:tc>
@@ -861,7 +172,475 @@
           </w:tcPr>
           <w:p>
             <w:r>
-              <w:t>HTML-код верхней панели, поиска, карточки товара и стилей.</w:t>
+              <w:t>Текстовая версия API-reference.</w:t>
+            </w:r>
+          </w:p>
+        </w:tc>
+      </w:tr>
+      <w:tr>
+        <w:tc>
+          <w:tcPr>
+            <w:tcW w:type="dxa" w:w="4844"/>
+            <w:vAlign w:val="center"/>
+          </w:tcPr>
+          <w:p>
+            <w:r>
+              <w:t>openapi.yaml</w:t>
+            </w:r>
+          </w:p>
+        </w:tc>
+        <w:tc>
+          <w:tcPr>
+            <w:tcW w:type="dxa" w:w="4844"/>
+            <w:vAlign w:val="center"/>
+          </w:tcPr>
+          <w:p>
+            <w:r>
+              <w:t>OpenAPI 3.0 спецификация.</w:t>
+            </w:r>
+          </w:p>
+        </w:tc>
+      </w:tr>
+      <w:tr>
+        <w:tc>
+          <w:tcPr>
+            <w:tcW w:type="dxa" w:w="4844"/>
+            <w:vAlign w:val="center"/>
+          </w:tcPr>
+          <w:p>
+            <w:r>
+              <w:t>developer_documentation.zip</w:t>
+            </w:r>
+          </w:p>
+        </w:tc>
+        <w:tc>
+          <w:tcPr>
+            <w:tcW w:type="dxa" w:w="4844"/>
+            <w:vAlign w:val="center"/>
+          </w:tcPr>
+          <w:p>
+            <w:r>
+              <w:t>Архив документации разработчика.</w:t>
+            </w:r>
+          </w:p>
+        </w:tc>
+      </w:tr>
+    </w:tbl>
+    <w:p>
+      <w:pPr>
+        <w:pStyle w:val="Heading2"/>
+      </w:pPr>
+      <w:r>
+        <w:t>API проекта</w:t>
+      </w:r>
+    </w:p>
+    <w:tbl>
+      <w:tblPr>
+        <w:tblStyle w:val="TableGrid"/>
+        <w:tblW w:type="auto" w:w="0"/>
+        <w:jc w:val="center"/>
+        <w:tblLook w:firstColumn="1" w:firstRow="1" w:lastColumn="0" w:lastRow="0" w:noHBand="0" w:noVBand="1" w:val="04A0"/>
+      </w:tblPr>
+      <w:tblGrid>
+        <w:gridCol w:w="3230"/>
+        <w:gridCol w:w="3230"/>
+        <w:gridCol w:w="3230"/>
+      </w:tblGrid>
+      <w:tr>
+        <w:tc>
+          <w:tcPr>
+            <w:tcW w:type="dxa" w:w="3230"/>
+            <w:vAlign w:val="center"/>
+          </w:tcPr>
+          <w:p>
+            <w:r>
+              <w:t>Метод</w:t>
+            </w:r>
+          </w:p>
+        </w:tc>
+        <w:tc>
+          <w:tcPr>
+            <w:tcW w:type="dxa" w:w="3230"/>
+            <w:vAlign w:val="center"/>
+          </w:tcPr>
+          <w:p>
+            <w:r>
+              <w:t>Endpoint</w:t>
+            </w:r>
+          </w:p>
+        </w:tc>
+        <w:tc>
+          <w:tcPr>
+            <w:tcW w:type="dxa" w:w="3230"/>
+            <w:vAlign w:val="center"/>
+          </w:tcPr>
+          <w:p>
+            <w:r>
+              <w:t>Назначение</w:t>
+            </w:r>
+          </w:p>
+        </w:tc>
+      </w:tr>
+      <w:tr>
+        <w:tc>
+          <w:tcPr>
+            <w:tcW w:type="dxa" w:w="3230"/>
+            <w:vAlign w:val="center"/>
+          </w:tcPr>
+          <w:p>
+            <w:r>
+              <w:t>POST</w:t>
+            </w:r>
+          </w:p>
+        </w:tc>
+        <w:tc>
+          <w:tcPr>
+            <w:tcW w:type="dxa" w:w="3230"/>
+            <w:vAlign w:val="center"/>
+          </w:tcPr>
+          <w:p>
+            <w:r>
+              <w:t>/api/auth/register</w:t>
+            </w:r>
+          </w:p>
+        </w:tc>
+        <w:tc>
+          <w:tcPr>
+            <w:tcW w:type="dxa" w:w="3230"/>
+            <w:vAlign w:val="center"/>
+          </w:tcPr>
+          <w:p>
+            <w:r>
+              <w:t>Регистрация пользователя</w:t>
+            </w:r>
+          </w:p>
+        </w:tc>
+      </w:tr>
+      <w:tr>
+        <w:tc>
+          <w:tcPr>
+            <w:tcW w:type="dxa" w:w="3230"/>
+            <w:vAlign w:val="center"/>
+          </w:tcPr>
+          <w:p>
+            <w:r>
+              <w:t>POST</w:t>
+            </w:r>
+          </w:p>
+        </w:tc>
+        <w:tc>
+          <w:tcPr>
+            <w:tcW w:type="dxa" w:w="3230"/>
+            <w:vAlign w:val="center"/>
+          </w:tcPr>
+          <w:p>
+            <w:r>
+              <w:t>/api/checkout/create-payment</w:t>
+            </w:r>
+          </w:p>
+        </w:tc>
+        <w:tc>
+          <w:tcPr>
+            <w:tcW w:type="dxa" w:w="3230"/>
+            <w:vAlign w:val="center"/>
+          </w:tcPr>
+          <w:p>
+            <w:r>
+              <w:t>Создание платежа</w:t>
+            </w:r>
+          </w:p>
+        </w:tc>
+      </w:tr>
+      <w:tr>
+        <w:tc>
+          <w:tcPr>
+            <w:tcW w:type="dxa" w:w="3230"/>
+            <w:vAlign w:val="center"/>
+          </w:tcPr>
+          <w:p>
+            <w:r>
+              <w:t>POST</w:t>
+            </w:r>
+          </w:p>
+        </w:tc>
+        <w:tc>
+          <w:tcPr>
+            <w:tcW w:type="dxa" w:w="3230"/>
+            <w:vAlign w:val="center"/>
+          </w:tcPr>
+          <w:p>
+            <w:r>
+              <w:t>/api/digiseller/callback</w:t>
+            </w:r>
+          </w:p>
+        </w:tc>
+        <w:tc>
+          <w:tcPr>
+            <w:tcW w:type="dxa" w:w="3230"/>
+            <w:vAlign w:val="center"/>
+          </w:tcPr>
+          <w:p>
+            <w:r>
+              <w:t>Webhook Digiseller</w:t>
+            </w:r>
+          </w:p>
+        </w:tc>
+      </w:tr>
+      <w:tr>
+        <w:tc>
+          <w:tcPr>
+            <w:tcW w:type="dxa" w:w="3230"/>
+            <w:vAlign w:val="center"/>
+          </w:tcPr>
+          <w:p>
+            <w:r>
+              <w:t>GET</w:t>
+            </w:r>
+          </w:p>
+        </w:tc>
+        <w:tc>
+          <w:tcPr>
+            <w:tcW w:type="dxa" w:w="3230"/>
+            <w:vAlign w:val="center"/>
+          </w:tcPr>
+          <w:p>
+            <w:r>
+              <w:t>/api/digiseller/return</w:t>
+            </w:r>
+          </w:p>
+        </w:tc>
+        <w:tc>
+          <w:tcPr>
+            <w:tcW w:type="dxa" w:w="3230"/>
+            <w:vAlign w:val="center"/>
+          </w:tcPr>
+          <w:p>
+            <w:r>
+              <w:t>Возврат после оплаты</w:t>
+            </w:r>
+          </w:p>
+        </w:tc>
+      </w:tr>
+      <w:tr>
+        <w:tc>
+          <w:tcPr>
+            <w:tcW w:type="dxa" w:w="3230"/>
+            <w:vAlign w:val="center"/>
+          </w:tcPr>
+          <w:p>
+            <w:r>
+              <w:t>GET</w:t>
+            </w:r>
+          </w:p>
+        </w:tc>
+        <w:tc>
+          <w:tcPr>
+            <w:tcW w:type="dxa" w:w="3230"/>
+            <w:vAlign w:val="center"/>
+          </w:tcPr>
+          <w:p>
+            <w:r>
+              <w:t>/api/favorites</w:t>
+            </w:r>
+          </w:p>
+        </w:tc>
+        <w:tc>
+          <w:tcPr>
+            <w:tcW w:type="dxa" w:w="3230"/>
+            <w:vAlign w:val="center"/>
+          </w:tcPr>
+          <w:p>
+            <w:r>
+              <w:t>Получение избранного</w:t>
+            </w:r>
+          </w:p>
+        </w:tc>
+      </w:tr>
+      <w:tr>
+        <w:tc>
+          <w:tcPr>
+            <w:tcW w:type="dxa" w:w="3230"/>
+            <w:vAlign w:val="center"/>
+          </w:tcPr>
+          <w:p>
+            <w:r>
+              <w:t>POST</w:t>
+            </w:r>
+          </w:p>
+        </w:tc>
+        <w:tc>
+          <w:tcPr>
+            <w:tcW w:type="dxa" w:w="3230"/>
+            <w:vAlign w:val="center"/>
+          </w:tcPr>
+          <w:p>
+            <w:r>
+              <w:t>/api/favorites/toggle</w:t>
+            </w:r>
+          </w:p>
+        </w:tc>
+        <w:tc>
+          <w:tcPr>
+            <w:tcW w:type="dxa" w:w="3230"/>
+            <w:vAlign w:val="center"/>
+          </w:tcPr>
+          <w:p>
+            <w:r>
+              <w:t>Переключение избранного</w:t>
+            </w:r>
+          </w:p>
+        </w:tc>
+      </w:tr>
+      <w:tr>
+        <w:tc>
+          <w:tcPr>
+            <w:tcW w:type="dxa" w:w="3230"/>
+            <w:vAlign w:val="center"/>
+          </w:tcPr>
+          <w:p>
+            <w:r>
+              <w:t>POST</w:t>
+            </w:r>
+          </w:p>
+        </w:tc>
+        <w:tc>
+          <w:tcPr>
+            <w:tcW w:type="dxa" w:w="3230"/>
+            <w:vAlign w:val="center"/>
+          </w:tcPr>
+          <w:p>
+            <w:r>
+              <w:t>/api/jobs/fulfill</w:t>
+            </w:r>
+          </w:p>
+        </w:tc>
+        <w:tc>
+          <w:tcPr>
+            <w:tcW w:type="dxa" w:w="3230"/>
+            <w:vAlign w:val="center"/>
+          </w:tcPr>
+          <w:p>
+            <w:r>
+              <w:t>Выдача цифрового товара</w:t>
+            </w:r>
+          </w:p>
+        </w:tc>
+      </w:tr>
+      <w:tr>
+        <w:tc>
+          <w:tcPr>
+            <w:tcW w:type="dxa" w:w="3230"/>
+            <w:vAlign w:val="center"/>
+          </w:tcPr>
+          <w:p>
+            <w:r>
+              <w:t>POST</w:t>
+            </w:r>
+          </w:p>
+        </w:tc>
+        <w:tc>
+          <w:tcPr>
+            <w:tcW w:type="dxa" w:w="3230"/>
+            <w:vAlign w:val="center"/>
+          </w:tcPr>
+          <w:p>
+            <w:r>
+              <w:t>/api/jobs/sync-digiseller</w:t>
+            </w:r>
+          </w:p>
+        </w:tc>
+        <w:tc>
+          <w:tcPr>
+            <w:tcW w:type="dxa" w:w="3230"/>
+            <w:vAlign w:val="center"/>
+          </w:tcPr>
+          <w:p>
+            <w:r>
+              <w:t>Синхронизация Digiseller</w:t>
+            </w:r>
+          </w:p>
+        </w:tc>
+      </w:tr>
+      <w:tr>
+        <w:tc>
+          <w:tcPr>
+            <w:tcW w:type="dxa" w:w="3230"/>
+            <w:vAlign w:val="center"/>
+          </w:tcPr>
+          <w:p>
+            <w:r>
+              <w:t>POST</w:t>
+            </w:r>
+          </w:p>
+        </w:tc>
+        <w:tc>
+          <w:tcPr>
+            <w:tcW w:type="dxa" w:w="3230"/>
+            <w:vAlign w:val="center"/>
+          </w:tcPr>
+          <w:p>
+            <w:r>
+              <w:t>/api/locale</w:t>
+            </w:r>
+          </w:p>
+        </w:tc>
+        <w:tc>
+          <w:tcPr>
+            <w:tcW w:type="dxa" w:w="3230"/>
+            <w:vAlign w:val="center"/>
+          </w:tcPr>
+          <w:p>
+            <w:r>
+              <w:t>Смена языка</w:t>
+            </w:r>
+          </w:p>
+        </w:tc>
+      </w:tr>
+    </w:tbl>
+    <w:p>
+      <w:pPr>
+        <w:pStyle w:val="Heading1"/>
+      </w:pPr>
+      <w:r>
+        <w:t>Пользовательская Wiki</w:t>
+      </w:r>
+    </w:p>
+    <w:p>
+      <w:r>
+        <w:t>Markdown-страницы Wiki используются как навигация и описание. Визуальное отображение интерфейса вынесено в отдельные HTML-файлы, потому что GitHub Markdown не применяет CSS к коду внутри code block. Каждый HTML-файл содержит собственный CSS и открывается в браузере как полноценный макет интерфейса.</w:t>
+      </w:r>
+    </w:p>
+    <w:tbl>
+      <w:tblPr>
+        <w:tblStyle w:val="TableGrid"/>
+        <w:tblW w:type="auto" w:w="0"/>
+        <w:jc w:val="center"/>
+        <w:tblLook w:firstColumn="1" w:firstRow="1" w:lastColumn="0" w:lastRow="0" w:noHBand="0" w:noVBand="1" w:val="04A0"/>
+      </w:tblPr>
+      <w:tblGrid>
+        <w:gridCol w:w="4844"/>
+        <w:gridCol w:w="4844"/>
+      </w:tblGrid>
+      <w:tr>
+        <w:tc>
+          <w:tcPr>
+            <w:tcW w:type="dxa" w:w="4844"/>
+            <w:vAlign w:val="center"/>
+          </w:tcPr>
+          <w:p>
+            <w:r>
+              <w:t>HTML-файл</w:t>
+            </w:r>
+          </w:p>
+        </w:tc>
+        <w:tc>
+          <w:tcPr>
+            <w:tcW w:type="dxa" w:w="4844"/>
+            <w:vAlign w:val="center"/>
+          </w:tcPr>
+          <w:p>
+            <w:r>
+              <w:t>Экран</w:t>
             </w:r>
           </w:p>
         </w:tc>
@@ -885,7 +664,7 @@
           </w:tcPr>
           <w:p>
             <w:r>
-              <w:t>Полная HTML-страница пользовательского интерфейса.</w:t>
+              <w:t>Главный экран магазина: шапка, поиск, карточки товаров.</w:t>
             </w:r>
           </w:p>
         </w:tc>
@@ -898,7 +677,7 @@
           </w:tcPr>
           <w:p>
             <w:r>
-              <w:t>Product-catalog.md</w:t>
+              <w:t>auth.html</w:t>
             </w:r>
           </w:p>
         </w:tc>
@@ -909,7 +688,7 @@
           </w:tcPr>
           <w:p>
             <w:r>
-              <w:t>HTML-код каталога и карточки товара.</w:t>
+              <w:t>Экран входа пользователя.</w:t>
             </w:r>
           </w:p>
         </w:tc>
@@ -922,7 +701,7 @@
           </w:tcPr>
           <w:p>
             <w:r>
-              <w:t>Cart.md</w:t>
+              <w:t>catalog.html</w:t>
             </w:r>
           </w:p>
         </w:tc>
@@ -933,7 +712,7 @@
           </w:tcPr>
           <w:p>
             <w:r>
-              <w:t>HTML-код кнопки корзины и добавления товара.</w:t>
+              <w:t>Каталог товаров.</w:t>
             </w:r>
           </w:p>
         </w:tc>
@@ -946,7 +725,7 @@
           </w:tcPr>
           <w:p>
             <w:r>
-              <w:t>Checkout.md</w:t>
+              <w:t>cart.html</w:t>
             </w:r>
           </w:p>
         </w:tc>
@@ -957,7 +736,7 @@
           </w:tcPr>
           <w:p>
             <w:r>
-              <w:t>HTML-код сценария оформления заказа.</w:t>
+              <w:t>Корзина.</w:t>
             </w:r>
           </w:p>
         </w:tc>
@@ -970,7 +749,7 @@
           </w:tcPr>
           <w:p>
             <w:r>
-              <w:t>Registration-and-login.md</w:t>
+              <w:t>checkout.html</w:t>
             </w:r>
           </w:p>
         </w:tc>
@@ -981,7 +760,7 @@
           </w:tcPr>
           <w:p>
             <w:r>
-              <w:t>HTML-код входа и регистрации.</w:t>
+              <w:t>Оформление заказа.</w:t>
             </w:r>
           </w:p>
         </w:tc>
@@ -994,7 +773,7 @@
           </w:tcPr>
           <w:p>
             <w:r>
-              <w:t>Order-details.md</w:t>
+              <w:t>order_status.html</w:t>
             </w:r>
           </w:p>
         </w:tc>
@@ -1005,7 +784,7 @@
           </w:tcPr>
           <w:p>
             <w:r>
-              <w:t>HTML-код статуса заказа.</w:t>
+              <w:t>Страница статуса заказа и цифрового ключа.</w:t>
             </w:r>
           </w:p>
         </w:tc>
@@ -1018,7 +797,7 @@
           </w:tcPr>
           <w:p>
             <w:r>
-              <w:t>Admin-panel.md</w:t>
+              <w:t>admin_panel.html</w:t>
             </w:r>
           </w:p>
         </w:tc>
@@ -1029,7 +808,7 @@
           </w:tcPr>
           <w:p>
             <w:r>
-              <w:t>HTML-код административной таблицы.</w:t>
+              <w:t>Административная панель.</w:t>
             </w:r>
           </w:p>
         </w:tc>
@@ -1040,7 +819,7 @@
         <w:pStyle w:val="Heading2"/>
       </w:pPr>
       <w:r>
-        <w:t>Пример HTML пользовательского интерфейса</w:t>
+        <w:t>Пример HTML-интерфейса</w:t>
       </w:r>
     </w:p>
     <w:p>
@@ -1049,99 +828,25 @@
           <w:rFonts w:ascii="Courier New" w:hAnsi="Courier New"/>
           <w:sz w:val="20"/>
         </w:rPr>
-        <w:t>&lt;section class="hero"&gt;</w:t>
+        <w:t>&lt;section class="grid"&gt;</w:t>
         <w:br/>
-        <w:t xml:space="preserve">  &lt;div class="panel"&gt;</w:t>
+        <w:t xml:space="preserve">  &lt;article class="card"&gt;</w:t>
         <w:br/>
-        <w:t xml:space="preserve">    &lt;span class="pill"&gt;Official supply - Processed via Digiseller&lt;/span&gt;</w:t>
+        <w:t xml:space="preserve">    &lt;div class="cover"&gt;Windows 11&lt;/div&gt;</w:t>
         <w:br/>
-        <w:t xml:space="preserve">    &lt;h1&gt;Official digital keys. Instant delivery.&lt;/h1&gt;</w:t>
+        <w:t xml:space="preserve">    &lt;div class="body"&gt;</w:t>
         <w:br/>
-        <w:t xml:space="preserve">    &lt;form class="search"&gt;</w:t>
+        <w:t xml:space="preserve">      &lt;div class="meta"&gt;&lt;span&gt;Windows&lt;/span&gt;&lt;strong&gt;$19.99&lt;/strong&gt;&lt;/div&gt;</w:t>
         <w:br/>
-        <w:t xml:space="preserve">      &lt;input type="search" placeholder="Search products..."&gt;</w:t>
+        <w:t xml:space="preserve">      &lt;p class="title"&gt;Windows 11 Pro License Key&lt;/p&gt;</w:t>
         <w:br/>
-        <w:t xml:space="preserve">      &lt;button class="button primary" type="submit"&gt;Search&lt;/button&gt;</w:t>
+        <w:t xml:space="preserve">      &lt;button class="button"&gt;Add to cart&lt;/button&gt;</w:t>
         <w:br/>
-        <w:t xml:space="preserve">    &lt;/form&gt;</w:t>
+        <w:t xml:space="preserve">    &lt;/div&gt;</w:t>
         <w:br/>
-        <w:t xml:space="preserve">  &lt;/div&gt;</w:t>
+        <w:t xml:space="preserve">  &lt;/article&gt;</w:t>
         <w:br/>
         <w:t>&lt;/section&gt;</w:t>
-      </w:r>
-    </w:p>
-    <w:p>
-      <w:pPr>
-        <w:pStyle w:val="Heading1"/>
-      </w:pPr>
-      <w:r>
-        <w:t>Пользовательский сценарий</w:t>
-      </w:r>
-    </w:p>
-    <w:p>
-      <w:pPr>
-        <w:pStyle w:val="ListNumber"/>
-      </w:pPr>
-      <w:r>
-        <w:t>Пользователь открывает HTML-интерфейс магазина.</w:t>
-      </w:r>
-    </w:p>
-    <w:p>
-      <w:pPr>
-        <w:pStyle w:val="ListNumber"/>
-      </w:pPr>
-      <w:r>
-        <w:t>Через поисковую строку или каталог выбирает цифровой товар.</w:t>
-      </w:r>
-    </w:p>
-    <w:p>
-      <w:pPr>
-        <w:pStyle w:val="ListNumber"/>
-      </w:pPr>
-      <w:r>
-        <w:t>Нажимает Details для просмотра товара или Add to cart для добавления в корзину.</w:t>
-      </w:r>
-    </w:p>
-    <w:p>
-      <w:pPr>
-        <w:pStyle w:val="ListNumber"/>
-      </w:pPr>
-      <w:r>
-        <w:t>Переходит к оформлению заказа.</w:t>
-      </w:r>
-    </w:p>
-    <w:p>
-      <w:pPr>
-        <w:pStyle w:val="ListNumber"/>
-      </w:pPr>
-      <w:r>
-        <w:t>Оплачивает заказ через Digiseller.</w:t>
-      </w:r>
-    </w:p>
-    <w:p>
-      <w:pPr>
-        <w:pStyle w:val="ListNumber"/>
-      </w:pPr>
-      <w:r>
-        <w:t>После подтверждения платежа получает цифровой товар на странице заказа.</w:t>
-      </w:r>
-    </w:p>
-    <w:p>
-      <w:pPr>
-        <w:pStyle w:val="Heading1"/>
-      </w:pPr>
-      <w:r>
-        <w:t>Размещение материалов</w:t>
-      </w:r>
-    </w:p>
-    <w:p>
-      <w:r>
-        <w:t>Материалы размещены в GitHub-репозитории: https://github.com/Lettalochka/sipi</w:t>
-      </w:r>
-    </w:p>
-    <w:p>
-      <w:r>
-        <w:t>API-документация находится в каталоге practice_10/developer_documentation, пользовательская Wiki - в каталоге practice_10/user_wiki.</w:t>
       </w:r>
     </w:p>
     <w:p>
@@ -1154,7 +859,7 @@
     </w:p>
     <w:p>
       <w:r>
-        <w:t>В ходе практической работы документация была приведена к требуемому виду: документация разработчика оформлена как HTML/API-reference, а пользовательская Wiki содержит HTML-код интерфейса вместо скриншотов. Это делает материалы более пригодными для проверки, повторного использования и публикации в репозитории.</w:t>
+        <w:t>Документация приведена к корректному виду: API-reference разработчика доступен как HTML-страница, пользовательская Wiki содержит ссылки на HTML-экраны с CSS, а не неисполняемые блоки кода. Это позволяет преподавателю открыть файлы и увидеть интерфейс визуально.</w:t>
       </w:r>
     </w:p>
     <w:sectPr>
@@ -1642,7 +1347,7 @@
       <w:outlineLvl w:val="2"/>
     </w:pPr>
     <w:rPr>
-      <w:rFonts w:asciiTheme="majorHAnsi" w:eastAsiaTheme="majorEastAsia" w:hAnsiTheme="majorHAnsi" w:cstheme="majorBidi" w:ascii="Times New Roman" w:hAnsi="Times New Roman"/>
+      <w:rFonts w:asciiTheme="majorHAnsi" w:eastAsiaTheme="majorEastAsia" w:hAnsiTheme="majorHAnsi" w:cstheme="majorBidi"/>
       <w:b/>
       <w:bCs/>
       <w:color w:val="4F81BD" w:themeColor="accent1"/>

</xml_diff>

<commit_message>
Rework user wiki as structured markdown
</commit_message>
<xml_diff>
--- a/reports/Практическая_работа_10_Документирование_ПО.docx
+++ b/reports/Практическая_работа_10_Документирование_ПО.docx
@@ -60,7 +60,7 @@
     </w:p>
     <w:p>
       <w:r>
-        <w:t>Дата выполнения: 24.04.2026</w:t>
+        <w:t>Дата выполнения: 25.04.2026</w:t>
       </w:r>
     </w:p>
     <w:p>
@@ -78,7 +78,7 @@
     </w:p>
     <w:p>
       <w:r>
-        <w:t>Создать документацию разработчика и пользователя. Документация разработчика оформлена как HTML API-reference. Пользовательская документация оформлена как Wiki-навигация и набор отдельных HTML-страниц интерфейса со встроенным CSS.</w:t>
+        <w:t>Создать документацию разработчика и пользовательскую документацию для проекта Legal Store. Документация разработчика представлена как API-reference, а пользовательская документация оформлена в стиле GitHub Wiki: отдельные страницы, разделы, сценарии работы, возможные проблемы и результат.</w:t>
       </w:r>
     </w:p>
     <w:p>
@@ -91,7 +91,7 @@
     </w:p>
     <w:p>
       <w:r>
-        <w:t>Для разработчика подготовлена HTML-страница api_reference.html. Она содержит таблицу API, карточки endpoint, примеры JSON-запросов и ответов, а также информацию об авторизации и служебных заголовках.</w:t>
+        <w:t>Для разработчика подготовлена API-документация. Она описывает серверные маршруты проекта, методы HTTP, назначение endpoint, параметры запросов, ответы и условия доступа.</w:t>
       </w:r>
     </w:p>
     <w:tbl>
@@ -148,7 +148,7 @@
           </w:tcPr>
           <w:p>
             <w:r>
-              <w:t>Визуальный API-reference для открытия в браузере.</w:t>
+              <w:t>Визуальная HTML-страница API-reference.</w:t>
             </w:r>
           </w:p>
         </w:tc>
@@ -172,7 +172,7 @@
           </w:tcPr>
           <w:p>
             <w:r>
-              <w:t>Текстовая версия API-reference.</w:t>
+              <w:t>Markdown-версия API-reference.</w:t>
             </w:r>
           </w:p>
         </w:tc>
@@ -231,7 +231,7 @@
         <w:pStyle w:val="Heading2"/>
       </w:pPr>
       <w:r>
-        <w:t>API проекта</w:t>
+        <w:t>Основные API проекта</w:t>
       </w:r>
     </w:p>
     <w:tbl>
@@ -405,41 +405,6 @@
           </w:tcPr>
           <w:p>
             <w:r>
-              <w:t>/api/digiseller/return</w:t>
-            </w:r>
-          </w:p>
-        </w:tc>
-        <w:tc>
-          <w:tcPr>
-            <w:tcW w:type="dxa" w:w="3230"/>
-            <w:vAlign w:val="center"/>
-          </w:tcPr>
-          <w:p>
-            <w:r>
-              <w:t>Возврат после оплаты</w:t>
-            </w:r>
-          </w:p>
-        </w:tc>
-      </w:tr>
-      <w:tr>
-        <w:tc>
-          <w:tcPr>
-            <w:tcW w:type="dxa" w:w="3230"/>
-            <w:vAlign w:val="center"/>
-          </w:tcPr>
-          <w:p>
-            <w:r>
-              <w:t>GET</w:t>
-            </w:r>
-          </w:p>
-        </w:tc>
-        <w:tc>
-          <w:tcPr>
-            <w:tcW w:type="dxa" w:w="3230"/>
-            <w:vAlign w:val="center"/>
-          </w:tcPr>
-          <w:p>
-            <w:r>
               <w:t>/api/favorites</w:t>
             </w:r>
           </w:p>
@@ -521,7 +486,7 @@
           </w:tcPr>
           <w:p>
             <w:r>
-              <w:t>Выдача цифрового товара</w:t>
+              <w:t>Обработка выдачи товара</w:t>
             </w:r>
           </w:p>
         </w:tc>
@@ -591,7 +556,7 @@
           </w:tcPr>
           <w:p>
             <w:r>
-              <w:t>Смена языка</w:t>
+              <w:t>Смена языка интерфейса</w:t>
             </w:r>
           </w:p>
         </w:tc>
@@ -607,7 +572,7 @@
     </w:p>
     <w:p>
       <w:r>
-        <w:t>Markdown-страницы Wiki используются как навигация и описание. Визуальное отображение интерфейса вынесено в отдельные HTML-файлы, потому что GitHub Markdown не применяет CSS к коду внутри code block. Каждый HTML-файл содержит собственный CSS и открывается в браузере как полноценный макет интерфейса.</w:t>
+        <w:t>Пользовательская документация оформлена как набор Markdown-страниц, аналогично GitHub Wiki. Для навигации добавлен файл _Sidebar.md. Каждая страница содержит назначение раздела, порядок действий пользователя, возможные проблемы и результат.</w:t>
       </w:r>
     </w:p>
     <w:tbl>
@@ -629,7 +594,7 @@
           </w:tcPr>
           <w:p>
             <w:r>
-              <w:t>HTML-файл</w:t>
+              <w:t>Страница</w:t>
             </w:r>
           </w:p>
         </w:tc>
@@ -640,7 +605,7 @@
           </w:tcPr>
           <w:p>
             <w:r>
-              <w:t>Экран</w:t>
+              <w:t>Содержание</w:t>
             </w:r>
           </w:p>
         </w:tc>
@@ -653,7 +618,7 @@
           </w:tcPr>
           <w:p>
             <w:r>
-              <w:t>user_interface.html</w:t>
+              <w:t>Home.md</w:t>
             </w:r>
           </w:p>
         </w:tc>
@@ -664,7 +629,7 @@
           </w:tcPr>
           <w:p>
             <w:r>
-              <w:t>Главный экран магазина: шапка, поиск, карточки товаров.</w:t>
+              <w:t>Главная страница Wiki и общий сценарий работы.</w:t>
             </w:r>
           </w:p>
         </w:tc>
@@ -677,7 +642,7 @@
           </w:tcPr>
           <w:p>
             <w:r>
-              <w:t>auth.html</w:t>
+              <w:t>_Sidebar.md</w:t>
             </w:r>
           </w:p>
         </w:tc>
@@ -688,7 +653,7 @@
           </w:tcPr>
           <w:p>
             <w:r>
-              <w:t>Экран входа пользователя.</w:t>
+              <w:t>Навигация по страницам Wiki.</w:t>
             </w:r>
           </w:p>
         </w:tc>
@@ -701,7 +666,7 @@
           </w:tcPr>
           <w:p>
             <w:r>
-              <w:t>catalog.html</w:t>
+              <w:t>Registration-and-login.md</w:t>
             </w:r>
           </w:p>
         </w:tc>
@@ -712,7 +677,7 @@
           </w:tcPr>
           <w:p>
             <w:r>
-              <w:t>Каталог товаров.</w:t>
+              <w:t>Вход и регистрация пользователя.</w:t>
             </w:r>
           </w:p>
         </w:tc>
@@ -725,7 +690,7 @@
           </w:tcPr>
           <w:p>
             <w:r>
-              <w:t>cart.html</w:t>
+              <w:t>User-interface.md</w:t>
             </w:r>
           </w:p>
         </w:tc>
@@ -736,7 +701,7 @@
           </w:tcPr>
           <w:p>
             <w:r>
-              <w:t>Корзина.</w:t>
+              <w:t>Описание основных элементов интерфейса.</w:t>
             </w:r>
           </w:p>
         </w:tc>
@@ -749,7 +714,7 @@
           </w:tcPr>
           <w:p>
             <w:r>
-              <w:t>checkout.html</w:t>
+              <w:t>Product-catalog.md</w:t>
             </w:r>
           </w:p>
         </w:tc>
@@ -760,7 +725,7 @@
           </w:tcPr>
           <w:p>
             <w:r>
-              <w:t>Оформление заказа.</w:t>
+              <w:t>Работа с каталогом и карточкой товара.</w:t>
             </w:r>
           </w:p>
         </w:tc>
@@ -773,7 +738,7 @@
           </w:tcPr>
           <w:p>
             <w:r>
-              <w:t>order_status.html</w:t>
+              <w:t>Cart.md</w:t>
             </w:r>
           </w:p>
         </w:tc>
@@ -784,7 +749,7 @@
           </w:tcPr>
           <w:p>
             <w:r>
-              <w:t>Страница статуса заказа и цифрового ключа.</w:t>
+              <w:t>Работа с корзиной.</w:t>
             </w:r>
           </w:p>
         </w:tc>
@@ -797,7 +762,7 @@
           </w:tcPr>
           <w:p>
             <w:r>
-              <w:t>admin_panel.html</w:t>
+              <w:t>Checkout.md</w:t>
             </w:r>
           </w:p>
         </w:tc>
@@ -808,7 +773,55 @@
           </w:tcPr>
           <w:p>
             <w:r>
-              <w:t>Административная панель.</w:t>
+              <w:t>Оформление заказа и оплата.</w:t>
+            </w:r>
+          </w:p>
+        </w:tc>
+      </w:tr>
+      <w:tr>
+        <w:tc>
+          <w:tcPr>
+            <w:tcW w:type="dxa" w:w="4844"/>
+            <w:vAlign w:val="center"/>
+          </w:tcPr>
+          <w:p>
+            <w:r>
+              <w:t>Order-details.md</w:t>
+            </w:r>
+          </w:p>
+        </w:tc>
+        <w:tc>
+          <w:tcPr>
+            <w:tcW w:type="dxa" w:w="4844"/>
+            <w:vAlign w:val="center"/>
+          </w:tcPr>
+          <w:p>
+            <w:r>
+              <w:t>Просмотр заказа и получение цифрового товара.</w:t>
+            </w:r>
+          </w:p>
+        </w:tc>
+      </w:tr>
+      <w:tr>
+        <w:tc>
+          <w:tcPr>
+            <w:tcW w:type="dxa" w:w="4844"/>
+            <w:vAlign w:val="center"/>
+          </w:tcPr>
+          <w:p>
+            <w:r>
+              <w:t>Admin-panel.md</w:t>
+            </w:r>
+          </w:p>
+        </w:tc>
+        <w:tc>
+          <w:tcPr>
+            <w:tcW w:type="dxa" w:w="4844"/>
+            <w:vAlign w:val="center"/>
+          </w:tcPr>
+          <w:p>
+            <w:r>
+              <w:t>Администрирование товаров, категорий и заказов.</w:t>
             </w:r>
           </w:p>
         </w:tc>
@@ -819,34 +832,12 @@
         <w:pStyle w:val="Heading2"/>
       </w:pPr>
       <w:r>
-        <w:t>Пример HTML-интерфейса</w:t>
+        <w:t>Пример структуры Wiki-страницы</w:t>
       </w:r>
     </w:p>
     <w:p>
       <w:r>
-        <w:rPr>
-          <w:rFonts w:ascii="Courier New" w:hAnsi="Courier New"/>
-          <w:sz w:val="20"/>
-        </w:rPr>
-        <w:t>&lt;section class="grid"&gt;</w:t>
-        <w:br/>
-        <w:t xml:space="preserve">  &lt;article class="card"&gt;</w:t>
-        <w:br/>
-        <w:t xml:space="preserve">    &lt;div class="cover"&gt;Windows 11&lt;/div&gt;</w:t>
-        <w:br/>
-        <w:t xml:space="preserve">    &lt;div class="body"&gt;</w:t>
-        <w:br/>
-        <w:t xml:space="preserve">      &lt;div class="meta"&gt;&lt;span&gt;Windows&lt;/span&gt;&lt;strong&gt;$19.99&lt;/strong&gt;&lt;/div&gt;</w:t>
-        <w:br/>
-        <w:t xml:space="preserve">      &lt;p class="title"&gt;Windows 11 Pro License Key&lt;/p&gt;</w:t>
-        <w:br/>
-        <w:t xml:space="preserve">      &lt;button class="button"&gt;Add to cart&lt;/button&gt;</w:t>
-        <w:br/>
-        <w:t xml:space="preserve">    &lt;/div&gt;</w:t>
-        <w:br/>
-        <w:t xml:space="preserve">  &lt;/article&gt;</w:t>
-        <w:br/>
-        <w:t>&lt;/section&gt;</w:t>
+        <w:t>Страницы построены по единому шаблону: назначение раздела, действия пользователя, возможные проблемы, результат. Такой формат соответствует виду GitHub Wiki и удобен для чтения в правой навигации Pages.</w:t>
       </w:r>
     </w:p>
     <w:p>
@@ -859,7 +850,7 @@
     </w:p>
     <w:p>
       <w:r>
-        <w:t>Документация приведена к корректному виду: API-reference разработчика доступен как HTML-страница, пользовательская Wiki содержит ссылки на HTML-экраны с CSS, а не неисполняемые блоки кода. Это позволяет преподавателю открыть файлы и увидеть интерфейс визуально.</w:t>
+        <w:t>В ходе работы документация была приведена к формату, подходящему для GitHub Wiki: без лишних HTML-макетов, с понятной навигацией и текстовым описанием пользовательских сценариев. Документация разработчика дополнена API-reference для серверных интерфейсов проекта.</w:t>
       </w:r>
     </w:p>
     <w:sectPr>

</xml_diff>

<commit_message>
Add wiki interface screenshots
</commit_message>
<xml_diff>
--- a/reports/Практическая_работа_10_Документирование_ПО.docx
+++ b/reports/Практическая_работа_10_Документирование_ПО.docx
@@ -853,9 +853,433 @@
         <w:t>В ходе работы документация была приведена к формату, подходящему для GitHub Wiki: без лишних HTML-макетов, с понятной навигацией и текстовым описанием пользовательских сценариев. Документация разработчика дополнена API-reference для серверных интерфейсов проекта.</w:t>
       </w:r>
     </w:p>
+    <w:p>
+      <w:r>
+        <w:br w:type="page"/>
+      </w:r>
+    </w:p>
+    <w:p>
+      <w:pPr>
+        <w:pStyle w:val="Heading1"/>
+        <w:jc w:val="left"/>
+      </w:pPr>
+      <w:r>
+        <w:t>Приложение. Скриншоты пользовательской Wiki</w:t>
+      </w:r>
+    </w:p>
+    <w:p>
+      <w:pPr>
+        <w:spacing w:after="200"/>
+      </w:pPr>
+      <w:r>
+        <w:t>В пользовательскую Wiki добавлены реальные визуальные скриншоты интерфейса, подготовленные из HTML/CSS-макетов. Это позволяет видеть экраны приложения прямо в GitHub Wiki без отображения исходного кода.</w:t>
+      </w:r>
+    </w:p>
+    <w:p>
+      <w:pPr>
+        <w:jc w:val="center"/>
+      </w:pPr>
+      <w:r>
+        <w:rPr>
+          <w:b/>
+          <w:color w:val="1F2937"/>
+          <w:sz w:val="22"/>
+        </w:rPr>
+        <w:t>Рисунок 1 - Главная страница Wiki</w:t>
+      </w:r>
+    </w:p>
+    <w:p>
+      <w:pPr>
+        <w:jc w:val="center"/>
+      </w:pPr>
+      <w:r>
+        <w:drawing>
+          <wp:inline xmlns:a="http://schemas.openxmlformats.org/drawingml/2006/main" xmlns:pic="http://schemas.openxmlformats.org/drawingml/2006/picture">
+            <wp:extent cx="6720840" cy="4305538"/>
+            <wp:docPr id="1" name="Picture 1"/>
+            <wp:cNvGraphicFramePr>
+              <a:graphicFrameLocks noChangeAspect="1"/>
+            </wp:cNvGraphicFramePr>
+            <a:graphic>
+              <a:graphicData uri="http://schemas.openxmlformats.org/drawingml/2006/picture">
+                <pic:pic>
+                  <pic:nvPicPr>
+                    <pic:cNvPr id="0" name="wiki-home.png"/>
+                    <pic:cNvPicPr/>
+                  </pic:nvPicPr>
+                  <pic:blipFill>
+                    <a:blip r:embed="rId9"/>
+                    <a:stretch>
+                      <a:fillRect/>
+                    </a:stretch>
+                  </pic:blipFill>
+                  <pic:spPr>
+                    <a:xfrm>
+                      <a:off x="0" y="0"/>
+                      <a:ext cx="6720840" cy="4305538"/>
+                    </a:xfrm>
+                    <a:prstGeom prst="rect"/>
+                  </pic:spPr>
+                </pic:pic>
+              </a:graphicData>
+            </a:graphic>
+          </wp:inline>
+        </w:drawing>
+      </w:r>
+    </w:p>
+    <w:p>
+      <w:r>
+        <w:br w:type="page"/>
+      </w:r>
+    </w:p>
+    <w:p>
+      <w:pPr>
+        <w:jc w:val="center"/>
+      </w:pPr>
+      <w:r>
+        <w:rPr>
+          <w:b/>
+          <w:color w:val="1F2937"/>
+          <w:sz w:val="22"/>
+        </w:rPr>
+        <w:t>Рисунок 2 - Вход и регистрация</w:t>
+      </w:r>
+    </w:p>
+    <w:p>
+      <w:pPr>
+        <w:jc w:val="center"/>
+      </w:pPr>
+      <w:r>
+        <w:drawing>
+          <wp:inline xmlns:a="http://schemas.openxmlformats.org/drawingml/2006/main" xmlns:pic="http://schemas.openxmlformats.org/drawingml/2006/picture">
+            <wp:extent cx="6720840" cy="4305538"/>
+            <wp:docPr id="2" name="Picture 2"/>
+            <wp:cNvGraphicFramePr>
+              <a:graphicFrameLocks noChangeAspect="1"/>
+            </wp:cNvGraphicFramePr>
+            <a:graphic>
+              <a:graphicData uri="http://schemas.openxmlformats.org/drawingml/2006/picture">
+                <pic:pic>
+                  <pic:nvPicPr>
+                    <pic:cNvPr id="0" name="wiki-auth.png"/>
+                    <pic:cNvPicPr/>
+                  </pic:nvPicPr>
+                  <pic:blipFill>
+                    <a:blip r:embed="rId10"/>
+                    <a:stretch>
+                      <a:fillRect/>
+                    </a:stretch>
+                  </pic:blipFill>
+                  <pic:spPr>
+                    <a:xfrm>
+                      <a:off x="0" y="0"/>
+                      <a:ext cx="6720840" cy="4305538"/>
+                    </a:xfrm>
+                    <a:prstGeom prst="rect"/>
+                  </pic:spPr>
+                </pic:pic>
+              </a:graphicData>
+            </a:graphic>
+          </wp:inline>
+        </w:drawing>
+      </w:r>
+    </w:p>
+    <w:p>
+      <w:r>
+        <w:br w:type="page"/>
+      </w:r>
+    </w:p>
+    <w:p>
+      <w:pPr>
+        <w:jc w:val="center"/>
+      </w:pPr>
+      <w:r>
+        <w:rPr>
+          <w:b/>
+          <w:color w:val="1F2937"/>
+          <w:sz w:val="22"/>
+        </w:rPr>
+        <w:t>Рисунок 3 - Каталог товаров</w:t>
+      </w:r>
+    </w:p>
+    <w:p>
+      <w:pPr>
+        <w:jc w:val="center"/>
+      </w:pPr>
+      <w:r>
+        <w:drawing>
+          <wp:inline xmlns:a="http://schemas.openxmlformats.org/drawingml/2006/main" xmlns:pic="http://schemas.openxmlformats.org/drawingml/2006/picture">
+            <wp:extent cx="6720840" cy="4305538"/>
+            <wp:docPr id="3" name="Picture 3"/>
+            <wp:cNvGraphicFramePr>
+              <a:graphicFrameLocks noChangeAspect="1"/>
+            </wp:cNvGraphicFramePr>
+            <a:graphic>
+              <a:graphicData uri="http://schemas.openxmlformats.org/drawingml/2006/picture">
+                <pic:pic>
+                  <pic:nvPicPr>
+                    <pic:cNvPr id="0" name="wiki-catalog.png"/>
+                    <pic:cNvPicPr/>
+                  </pic:nvPicPr>
+                  <pic:blipFill>
+                    <a:blip r:embed="rId11"/>
+                    <a:stretch>
+                      <a:fillRect/>
+                    </a:stretch>
+                  </pic:blipFill>
+                  <pic:spPr>
+                    <a:xfrm>
+                      <a:off x="0" y="0"/>
+                      <a:ext cx="6720840" cy="4305538"/>
+                    </a:xfrm>
+                    <a:prstGeom prst="rect"/>
+                  </pic:spPr>
+                </pic:pic>
+              </a:graphicData>
+            </a:graphic>
+          </wp:inline>
+        </w:drawing>
+      </w:r>
+    </w:p>
+    <w:p>
+      <w:r>
+        <w:br w:type="page"/>
+      </w:r>
+    </w:p>
+    <w:p>
+      <w:pPr>
+        <w:jc w:val="center"/>
+      </w:pPr>
+      <w:r>
+        <w:rPr>
+          <w:b/>
+          <w:color w:val="1F2937"/>
+          <w:sz w:val="22"/>
+        </w:rPr>
+        <w:t>Рисунок 4 - Корзина</w:t>
+      </w:r>
+    </w:p>
+    <w:p>
+      <w:pPr>
+        <w:jc w:val="center"/>
+      </w:pPr>
+      <w:r>
+        <w:drawing>
+          <wp:inline xmlns:a="http://schemas.openxmlformats.org/drawingml/2006/main" xmlns:pic="http://schemas.openxmlformats.org/drawingml/2006/picture">
+            <wp:extent cx="6720840" cy="4305538"/>
+            <wp:docPr id="4" name="Picture 4"/>
+            <wp:cNvGraphicFramePr>
+              <a:graphicFrameLocks noChangeAspect="1"/>
+            </wp:cNvGraphicFramePr>
+            <a:graphic>
+              <a:graphicData uri="http://schemas.openxmlformats.org/drawingml/2006/picture">
+                <pic:pic>
+                  <pic:nvPicPr>
+                    <pic:cNvPr id="0" name="wiki-cart.png"/>
+                    <pic:cNvPicPr/>
+                  </pic:nvPicPr>
+                  <pic:blipFill>
+                    <a:blip r:embed="rId12"/>
+                    <a:stretch>
+                      <a:fillRect/>
+                    </a:stretch>
+                  </pic:blipFill>
+                  <pic:spPr>
+                    <a:xfrm>
+                      <a:off x="0" y="0"/>
+                      <a:ext cx="6720840" cy="4305538"/>
+                    </a:xfrm>
+                    <a:prstGeom prst="rect"/>
+                  </pic:spPr>
+                </pic:pic>
+              </a:graphicData>
+            </a:graphic>
+          </wp:inline>
+        </w:drawing>
+      </w:r>
+    </w:p>
+    <w:p>
+      <w:r>
+        <w:br w:type="page"/>
+      </w:r>
+    </w:p>
+    <w:p>
+      <w:pPr>
+        <w:jc w:val="center"/>
+      </w:pPr>
+      <w:r>
+        <w:rPr>
+          <w:b/>
+          <w:color w:val="1F2937"/>
+          <w:sz w:val="22"/>
+        </w:rPr>
+        <w:t>Рисунок 5 - Оформление заказа</w:t>
+      </w:r>
+    </w:p>
+    <w:p>
+      <w:pPr>
+        <w:jc w:val="center"/>
+      </w:pPr>
+      <w:r>
+        <w:drawing>
+          <wp:inline xmlns:a="http://schemas.openxmlformats.org/drawingml/2006/main" xmlns:pic="http://schemas.openxmlformats.org/drawingml/2006/picture">
+            <wp:extent cx="6720840" cy="4305538"/>
+            <wp:docPr id="5" name="Picture 5"/>
+            <wp:cNvGraphicFramePr>
+              <a:graphicFrameLocks noChangeAspect="1"/>
+            </wp:cNvGraphicFramePr>
+            <a:graphic>
+              <a:graphicData uri="http://schemas.openxmlformats.org/drawingml/2006/picture">
+                <pic:pic>
+                  <pic:nvPicPr>
+                    <pic:cNvPr id="0" name="wiki-checkout.png"/>
+                    <pic:cNvPicPr/>
+                  </pic:nvPicPr>
+                  <pic:blipFill>
+                    <a:blip r:embed="rId13"/>
+                    <a:stretch>
+                      <a:fillRect/>
+                    </a:stretch>
+                  </pic:blipFill>
+                  <pic:spPr>
+                    <a:xfrm>
+                      <a:off x="0" y="0"/>
+                      <a:ext cx="6720840" cy="4305538"/>
+                    </a:xfrm>
+                    <a:prstGeom prst="rect"/>
+                  </pic:spPr>
+                </pic:pic>
+              </a:graphicData>
+            </a:graphic>
+          </wp:inline>
+        </w:drawing>
+      </w:r>
+    </w:p>
+    <w:p>
+      <w:r>
+        <w:br w:type="page"/>
+      </w:r>
+    </w:p>
+    <w:p>
+      <w:pPr>
+        <w:jc w:val="center"/>
+      </w:pPr>
+      <w:r>
+        <w:rPr>
+          <w:b/>
+          <w:color w:val="1F2937"/>
+          <w:sz w:val="22"/>
+        </w:rPr>
+        <w:t>Рисунок 6 - Детали заказа</w:t>
+      </w:r>
+    </w:p>
+    <w:p>
+      <w:pPr>
+        <w:jc w:val="center"/>
+      </w:pPr>
+      <w:r>
+        <w:drawing>
+          <wp:inline xmlns:a="http://schemas.openxmlformats.org/drawingml/2006/main" xmlns:pic="http://schemas.openxmlformats.org/drawingml/2006/picture">
+            <wp:extent cx="6720840" cy="4305538"/>
+            <wp:docPr id="6" name="Picture 6"/>
+            <wp:cNvGraphicFramePr>
+              <a:graphicFrameLocks noChangeAspect="1"/>
+            </wp:cNvGraphicFramePr>
+            <a:graphic>
+              <a:graphicData uri="http://schemas.openxmlformats.org/drawingml/2006/picture">
+                <pic:pic>
+                  <pic:nvPicPr>
+                    <pic:cNvPr id="0" name="wiki-order.png"/>
+                    <pic:cNvPicPr/>
+                  </pic:nvPicPr>
+                  <pic:blipFill>
+                    <a:blip r:embed="rId14"/>
+                    <a:stretch>
+                      <a:fillRect/>
+                    </a:stretch>
+                  </pic:blipFill>
+                  <pic:spPr>
+                    <a:xfrm>
+                      <a:off x="0" y="0"/>
+                      <a:ext cx="6720840" cy="4305538"/>
+                    </a:xfrm>
+                    <a:prstGeom prst="rect"/>
+                  </pic:spPr>
+                </pic:pic>
+              </a:graphicData>
+            </a:graphic>
+          </wp:inline>
+        </w:drawing>
+      </w:r>
+    </w:p>
+    <w:p>
+      <w:r>
+        <w:br w:type="page"/>
+      </w:r>
+    </w:p>
+    <w:p>
+      <w:pPr>
+        <w:jc w:val="center"/>
+      </w:pPr>
+      <w:r>
+        <w:rPr>
+          <w:b/>
+          <w:color w:val="1F2937"/>
+          <w:sz w:val="22"/>
+        </w:rPr>
+        <w:t>Рисунок 7 - Административная панель</w:t>
+      </w:r>
+    </w:p>
+    <w:p>
+      <w:pPr>
+        <w:jc w:val="center"/>
+      </w:pPr>
+      <w:r>
+        <w:drawing>
+          <wp:inline xmlns:a="http://schemas.openxmlformats.org/drawingml/2006/main" xmlns:pic="http://schemas.openxmlformats.org/drawingml/2006/picture">
+            <wp:extent cx="6720840" cy="4552319"/>
+            <wp:docPr id="7" name="Picture 7"/>
+            <wp:cNvGraphicFramePr>
+              <a:graphicFrameLocks noChangeAspect="1"/>
+            </wp:cNvGraphicFramePr>
+            <a:graphic>
+              <a:graphicData uri="http://schemas.openxmlformats.org/drawingml/2006/picture">
+                <pic:pic>
+                  <pic:nvPicPr>
+                    <pic:cNvPr id="0" name="wiki-admin.png"/>
+                    <pic:cNvPicPr/>
+                  </pic:nvPicPr>
+                  <pic:blipFill>
+                    <a:blip r:embed="rId15"/>
+                    <a:stretch>
+                      <a:fillRect/>
+                    </a:stretch>
+                  </pic:blipFill>
+                  <pic:spPr>
+                    <a:xfrm>
+                      <a:off x="0" y="0"/>
+                      <a:ext cx="6720840" cy="4552319"/>
+                    </a:xfrm>
+                    <a:prstGeom prst="rect"/>
+                  </pic:spPr>
+                </pic:pic>
+              </a:graphicData>
+            </a:graphic>
+          </wp:inline>
+        </w:drawing>
+      </w:r>
+    </w:p>
+    <w:p>
+      <w:pPr>
+        <w:spacing w:before="160"/>
+      </w:pPr>
+      <w:r>
+        <w:t>Результат: пользовательская документация содержит текстовые сценарии и визуальные экраны интерфейса, достаточные для понимания работы приложения конечным пользователем.</w:t>
+      </w:r>
+    </w:p>
     <w:sectPr>
       <w:pgSz w:w="12240" w:h="15840"/>
-      <w:pgMar w:top="1134" w:right="850" w:bottom="1134" w:left="1701" w:header="720" w:footer="720" w:gutter="0"/>
+      <w:pgMar w:top="792" w:right="792" w:bottom="792" w:left="792" w:header="720" w:footer="720" w:gutter="0"/>
       <w:cols w:space="720"/>
       <w:docGrid w:linePitch="360"/>
     </w:sectPr>

</xml_diff>

<commit_message>
Rename project to WinKey in docs
</commit_message>
<xml_diff>
--- a/reports/Практическая_работа_10_Документирование_ПО.docx
+++ b/reports/Практическая_работа_10_Документирование_ПО.docx
@@ -50,7 +50,7 @@
     </w:p>
     <w:p>
       <w:r>
-        <w:t>Проект: Legal Store</w:t>
+        <w:t>Проект: WinKey</w:t>
       </w:r>
     </w:p>
     <w:p>
@@ -78,7 +78,7 @@
     </w:p>
     <w:p>
       <w:r>
-        <w:t>Создать документацию разработчика и пользовательскую документацию для проекта Legal Store. Документация разработчика представлена как API-reference, а пользовательская документация оформлена в стиле GitHub Wiki: отдельные страницы, разделы, сценарии работы, возможные проблемы и результат.</w:t>
+        <w:t>Создать документацию разработчика и пользовательскую документацию для проекта WinKey. Документация разработчика представлена как API-reference, а пользовательская документация оформлена в стиле GitHub Wiki: отдельные страницы, разделы, сценарии работы, возможные проблемы и результат.</w:t>
       </w:r>
     </w:p>
     <w:p>
@@ -859,6 +859,11 @@
       </w:r>
     </w:p>
     <w:p>
+      <w:r>
+        <w:br w:type="page"/>
+      </w:r>
+    </w:p>
+    <w:p>
       <w:pPr>
         <w:pStyle w:val="Heading1"/>
         <w:jc w:val="left"/>
@@ -872,7 +877,7 @@
         <w:spacing w:after="200"/>
       </w:pPr>
       <w:r>
-        <w:t>В пользовательскую Wiki добавлены реальные визуальные скриншоты интерфейса, подготовленные из HTML/CSS-макетов. Это позволяет видеть экраны приложения прямо в GitHub Wiki без отображения исходного кода.</w:t>
+        <w:t>В пользовательскую Wiki добавлены реальные визуальные скриншоты интерфейса WinKey, подготовленные из HTML/CSS-макетов. Это позволяет видеть экраны приложения прямо в GitHub Wiki без отображения исходного кода.</w:t>
       </w:r>
     </w:p>
     <w:p>
@@ -908,7 +913,7 @@
                     <pic:cNvPicPr/>
                   </pic:nvPicPr>
                   <pic:blipFill>
-                    <a:blip r:embed="rId9"/>
+                    <a:blip r:embed="rId16"/>
                     <a:stretch>
                       <a:fillRect/>
                     </a:stretch>
@@ -965,7 +970,7 @@
                     <pic:cNvPicPr/>
                   </pic:nvPicPr>
                   <pic:blipFill>
-                    <a:blip r:embed="rId10"/>
+                    <a:blip r:embed="rId17"/>
                     <a:stretch>
                       <a:fillRect/>
                     </a:stretch>
@@ -1022,7 +1027,7 @@
                     <pic:cNvPicPr/>
                   </pic:nvPicPr>
                   <pic:blipFill>
-                    <a:blip r:embed="rId11"/>
+                    <a:blip r:embed="rId18"/>
                     <a:stretch>
                       <a:fillRect/>
                     </a:stretch>
@@ -1079,7 +1084,7 @@
                     <pic:cNvPicPr/>
                   </pic:nvPicPr>
                   <pic:blipFill>
-                    <a:blip r:embed="rId12"/>
+                    <a:blip r:embed="rId19"/>
                     <a:stretch>
                       <a:fillRect/>
                     </a:stretch>
@@ -1136,7 +1141,7 @@
                     <pic:cNvPicPr/>
                   </pic:nvPicPr>
                   <pic:blipFill>
-                    <a:blip r:embed="rId13"/>
+                    <a:blip r:embed="rId20"/>
                     <a:stretch>
                       <a:fillRect/>
                     </a:stretch>
@@ -1193,7 +1198,7 @@
                     <pic:cNvPicPr/>
                   </pic:nvPicPr>
                   <pic:blipFill>
-                    <a:blip r:embed="rId14"/>
+                    <a:blip r:embed="rId21"/>
                     <a:stretch>
                       <a:fillRect/>
                     </a:stretch>
@@ -1250,7 +1255,7 @@
                     <pic:cNvPicPr/>
                   </pic:nvPicPr>
                   <pic:blipFill>
-                    <a:blip r:embed="rId15"/>
+                    <a:blip r:embed="rId22"/>
                     <a:stretch>
                       <a:fillRect/>
                     </a:stretch>
@@ -1274,7 +1279,7 @@
         <w:spacing w:before="160"/>
       </w:pPr>
       <w:r>
-        <w:t>Результат: пользовательская документация содержит текстовые сценарии и визуальные экраны интерфейса, достаточные для понимания работы приложения конечным пользователем.</w:t>
+        <w:t>Результат: пользовательская документация содержит текстовые сценарии и визуальные экраны интерфейса WinKey, достаточные для понимания работы приложения конечным пользователем.</w:t>
       </w:r>
     </w:p>
     <w:sectPr>

</xml_diff>